<commit_message>
Modificacion de Avance Preliminar 1.1, creacion de Planificacion de auditoria y cronograma de auditoria
</commit_message>
<xml_diff>
--- a/PROYECTO FINAL/AVANCE PRELIMINAR 1.1.docx
+++ b/PROYECTO FINAL/AVANCE PRELIMINAR 1.1.docx
@@ -3281,6 +3281,7 @@
         <w:tabs>
           <w:tab w:val="left" w:pos="927"/>
         </w:tabs>
+        <w:ind w:left="927" w:hanging="927"/>
         <w:rPr>
           <w:rFonts w:ascii="Arial" w:hAnsi="Arial" w:cs="Arial"/>
           <w:b/>
@@ -3295,6 +3296,7 @@
         <w:tabs>
           <w:tab w:val="left" w:pos="927"/>
         </w:tabs>
+        <w:ind w:left="1416" w:hanging="1416"/>
         <w:rPr>
           <w:rFonts w:ascii="Arial" w:hAnsi="Arial" w:cs="Arial"/>
           <w:b/>
@@ -8155,12 +8157,26 @@
       <w:pPr>
         <w:rPr>
           <w:rFonts w:ascii="Arial" w:hAnsi="Arial" w:cs="Arial"/>
+          <w:b/>
+          <w:bCs/>
           <w:sz w:val="24"/>
           <w:szCs w:val="24"/>
           <w:lang w:val="es-US"/>
         </w:rPr>
       </w:pPr>
-      <w:r>
+    </w:p>
+    <w:p>
+      <w:pPr>
+        <w:rPr>
+          <w:rFonts w:ascii="Arial" w:hAnsi="Arial" w:cs="Arial"/>
+          <w:sz w:val="24"/>
+          <w:szCs w:val="24"/>
+          <w:lang w:val="es-US"/>
+        </w:rPr>
+      </w:pPr>
+    </w:p>
+    <w:p>
+      <w:pPr>
         <w:rPr>
           <w:rFonts w:ascii="Arial" w:hAnsi="Arial" w:cs="Arial"/>
           <w:b/>
@@ -8169,78 +8185,17 @@
           <w:szCs w:val="24"/>
           <w:lang w:val="es-US"/>
         </w:rPr>
-        <w:t>Recomendación:</w:t>
-      </w:r>
+      </w:pPr>
       <w:r>
         <w:rPr>
           <w:rFonts w:ascii="Arial" w:hAnsi="Arial" w:cs="Arial"/>
+          <w:b/>
+          <w:bCs/>
           <w:sz w:val="24"/>
           <w:szCs w:val="24"/>
           <w:lang w:val="es-US"/>
         </w:rPr>
-        <w:t> Designar formalmente a un docente como </w:t>
-      </w:r>
-      <w:r>
-        <w:rPr>
-          <w:rFonts w:ascii="Arial" w:hAnsi="Arial" w:cs="Arial"/>
-          <w:b/>
-          <w:bCs/>
-          <w:sz w:val="24"/>
-          <w:szCs w:val="24"/>
-          <w:lang w:val="es-US"/>
-        </w:rPr>
-        <w:t>Coordinador de Tecnología Educativa</w:t>
-      </w:r>
-      <w:r>
-        <w:rPr>
-          <w:rFonts w:ascii="Arial" w:hAnsi="Arial" w:cs="Arial"/>
-          <w:sz w:val="24"/>
-          <w:szCs w:val="24"/>
-          <w:lang w:val="es-US"/>
-        </w:rPr>
-        <w:t xml:space="preserve"> con al menos 5 horas semanales dedicadas </w:t>
-      </w:r>
-      <w:r>
-        <w:rPr>
-          <w:rFonts w:ascii="Arial" w:hAnsi="Arial" w:cs="Arial"/>
-          <w:sz w:val="24"/>
-          <w:szCs w:val="24"/>
-          <w:lang w:val="es-US"/>
-        </w:rPr>
         <w:lastRenderedPageBreak/>
-        <w:t>exclusivamente al mantenimiento de la red y el laboratorio, reconocidas en su carga horaria oficial.</w:t>
-      </w:r>
-    </w:p>
-    <w:p>
-      <w:pPr>
-        <w:rPr>
-          <w:rFonts w:ascii="Arial" w:hAnsi="Arial" w:cs="Arial"/>
-          <w:sz w:val="24"/>
-          <w:szCs w:val="24"/>
-          <w:lang w:val="es-US"/>
-        </w:rPr>
-      </w:pPr>
-    </w:p>
-    <w:p>
-      <w:pPr>
-        <w:rPr>
-          <w:rFonts w:ascii="Arial" w:hAnsi="Arial" w:cs="Arial"/>
-          <w:b/>
-          <w:bCs/>
-          <w:sz w:val="24"/>
-          <w:szCs w:val="24"/>
-          <w:lang w:val="es-US"/>
-        </w:rPr>
-      </w:pPr>
-      <w:r>
-        <w:rPr>
-          <w:rFonts w:ascii="Arial" w:hAnsi="Arial" w:cs="Arial"/>
-          <w:b/>
-          <w:bCs/>
-          <w:sz w:val="24"/>
-          <w:szCs w:val="24"/>
-          <w:lang w:val="es-US"/>
-        </w:rPr>
         <w:t>Eficiencia en los Procedimientos</w:t>
       </w:r>
     </w:p>
@@ -9956,6 +9911,8 @@
             </w:r>
           </w:p>
         </w:tc>
+        <w:bookmarkStart w:id="0" w:name="_GoBack"/>
+        <w:bookmarkEnd w:id="0"/>
       </w:tr>
     </w:tbl>
     <w:p>
@@ -9987,6 +9944,42 @@
         </w:rPr>
         <w:t> 0% (ningún procedimiento crítico está documentado)</w:t>
       </w:r>
+    </w:p>
+    <w:p>
+      <w:pPr>
+        <w:rPr>
+          <w:rFonts w:ascii="Arial" w:hAnsi="Arial" w:cs="Arial"/>
+          <w:b/>
+          <w:bCs/>
+          <w:sz w:val="24"/>
+          <w:szCs w:val="24"/>
+          <w:lang w:val="es-US"/>
+        </w:rPr>
+      </w:pPr>
+    </w:p>
+    <w:p>
+      <w:pPr>
+        <w:rPr>
+          <w:rFonts w:ascii="Arial" w:hAnsi="Arial" w:cs="Arial"/>
+          <w:b/>
+          <w:bCs/>
+          <w:sz w:val="24"/>
+          <w:szCs w:val="24"/>
+          <w:lang w:val="es-US"/>
+        </w:rPr>
+      </w:pPr>
+    </w:p>
+    <w:p>
+      <w:pPr>
+        <w:rPr>
+          <w:rFonts w:ascii="Arial" w:hAnsi="Arial" w:cs="Arial"/>
+          <w:b/>
+          <w:bCs/>
+          <w:sz w:val="24"/>
+          <w:szCs w:val="24"/>
+          <w:lang w:val="es-US"/>
+        </w:rPr>
+      </w:pPr>
     </w:p>
     <w:p>
       <w:pPr>
@@ -12023,6 +12016,7 @@
     </w:tbl>
     <w:p>
       <w:pPr>
+        <w:ind w:left="708" w:hanging="708"/>
         <w:rPr>
           <w:rFonts w:ascii="Arial" w:hAnsi="Arial" w:cs="Arial"/>
           <w:sz w:val="24"/>
@@ -12185,7 +12179,6 @@
           <w:szCs w:val="24"/>
           <w:lang w:val="es-US"/>
         </w:rPr>
-        <w:lastRenderedPageBreak/>
         <w:t>EVALUACIÓN DE LOS ASPECTOS TÉCNICOS – REDES</w:t>
       </w:r>
     </w:p>
@@ -14831,7 +14824,7 @@
     </w:p>
     <w:tbl>
       <w:tblPr>
-        <w:tblW w:w="11280" w:type="dxa"/>
+        <w:tblW w:w="10007" w:type="dxa"/>
         <w:tblBorders>
           <w:top w:val="single" w:sz="4" w:space="0" w:color="auto"/>
           <w:left w:val="single" w:sz="4" w:space="0" w:color="auto"/>
@@ -14849,11 +14842,12 @@
         <w:tblLook w:val="04A0" w:firstRow="1" w:lastRow="0" w:firstColumn="1" w:lastColumn="0" w:noHBand="0" w:noVBand="1"/>
       </w:tblPr>
       <w:tblGrid>
-        <w:gridCol w:w="1938"/>
-        <w:gridCol w:w="9342"/>
+        <w:gridCol w:w="1870"/>
+        <w:gridCol w:w="8137"/>
       </w:tblGrid>
       <w:tr>
         <w:trPr>
+          <w:trHeight w:val="402"/>
           <w:tblHeader/>
         </w:trPr>
         <w:tc>
@@ -14926,6 +14920,9 @@
         </w:tc>
       </w:tr>
       <w:tr>
+        <w:trPr>
+          <w:trHeight w:val="680"/>
+        </w:trPr>
         <w:tc>
           <w:tcPr>
             <w:tcW w:w="0" w:type="auto"/>
@@ -14994,6 +14991,9 @@
         </w:tc>
       </w:tr>
       <w:tr>
+        <w:trPr>
+          <w:trHeight w:val="680"/>
+        </w:trPr>
         <w:tc>
           <w:tcPr>
             <w:tcW w:w="0" w:type="auto"/>
@@ -15062,6 +15062,9 @@
         </w:tc>
       </w:tr>
       <w:tr>
+        <w:trPr>
+          <w:trHeight w:val="680"/>
+        </w:trPr>
         <w:tc>
           <w:tcPr>
             <w:tcW w:w="0" w:type="auto"/>
@@ -15130,6 +15133,9 @@
         </w:tc>
       </w:tr>
       <w:tr>
+        <w:trPr>
+          <w:trHeight w:val="415"/>
+        </w:trPr>
         <w:tc>
           <w:tcPr>
             <w:tcW w:w="0" w:type="auto"/>
@@ -16677,7 +16683,7 @@
     </w:p>
     <w:tbl>
       <w:tblPr>
-        <w:tblW w:w="0" w:type="auto"/>
+        <w:tblW w:w="10000" w:type="dxa"/>
         <w:tblBorders>
           <w:top w:val="single" w:sz="4" w:space="0" w:color="auto"/>
           <w:left w:val="single" w:sz="4" w:space="0" w:color="auto"/>
@@ -16695,15 +16701,16 @@
         <w:tblLook w:val="04A0" w:firstRow="1" w:lastRow="0" w:firstColumn="1" w:lastColumn="0" w:noHBand="0" w:noVBand="1"/>
       </w:tblPr>
       <w:tblGrid>
-        <w:gridCol w:w="1611"/>
-        <w:gridCol w:w="1113"/>
-        <w:gridCol w:w="1482"/>
-        <w:gridCol w:w="1469"/>
-        <w:gridCol w:w="1374"/>
-        <w:gridCol w:w="1779"/>
+        <w:gridCol w:w="2024"/>
+        <w:gridCol w:w="1230"/>
+        <w:gridCol w:w="1604"/>
+        <w:gridCol w:w="1591"/>
+        <w:gridCol w:w="1495"/>
+        <w:gridCol w:w="2056"/>
       </w:tblGrid>
       <w:tr>
         <w:trPr>
+          <w:trHeight w:val="710"/>
           <w:tblHeader/>
         </w:trPr>
         <w:tc>
@@ -16912,6 +16919,9 @@
         </w:tc>
       </w:tr>
       <w:tr>
+        <w:trPr>
+          <w:trHeight w:val="985"/>
+        </w:trPr>
         <w:tc>
           <w:tcPr>
             <w:tcW w:w="0" w:type="auto"/>
@@ -17214,6 +17224,9 @@
         </w:tc>
       </w:tr>
       <w:tr>
+        <w:trPr>
+          <w:trHeight w:val="998"/>
+        </w:trPr>
         <w:tc>
           <w:tcPr>
             <w:tcW w:w="0" w:type="auto"/>
@@ -17516,6 +17529,9 @@
         </w:tc>
       </w:tr>
       <w:tr>
+        <w:trPr>
+          <w:trHeight w:val="802"/>
+        </w:trPr>
         <w:tc>
           <w:tcPr>
             <w:tcW w:w="0" w:type="auto"/>
@@ -17818,6 +17834,9 @@
         </w:tc>
       </w:tr>
       <w:tr>
+        <w:trPr>
+          <w:trHeight w:val="985"/>
+        </w:trPr>
         <w:tc>
           <w:tcPr>
             <w:tcW w:w="0" w:type="auto"/>
@@ -18120,6 +18139,9 @@
         </w:tc>
       </w:tr>
       <w:tr>
+        <w:trPr>
+          <w:trHeight w:val="1275"/>
+        </w:trPr>
         <w:tc>
           <w:tcPr>
             <w:tcW w:w="0" w:type="auto"/>
@@ -18422,6 +18444,9 @@
         </w:tc>
       </w:tr>
       <w:tr>
+        <w:trPr>
+          <w:trHeight w:val="998"/>
+        </w:trPr>
         <w:tc>
           <w:tcPr>
             <w:tcW w:w="0" w:type="auto"/>
@@ -18724,6 +18749,9 @@
         </w:tc>
       </w:tr>
       <w:tr>
+        <w:trPr>
+          <w:trHeight w:val="1262"/>
+        </w:trPr>
         <w:tc>
           <w:tcPr>
             <w:tcW w:w="0" w:type="auto"/>
@@ -19030,12 +19058,16 @@
       <w:pPr>
         <w:rPr>
           <w:rFonts w:ascii="Arial" w:hAnsi="Arial" w:cs="Arial"/>
+          <w:b/>
+          <w:bCs/>
           <w:sz w:val="24"/>
           <w:szCs w:val="24"/>
           <w:lang w:val="es-US"/>
         </w:rPr>
       </w:pPr>
-      <w:r>
+    </w:p>
+    <w:p>
+      <w:pPr>
         <w:rPr>
           <w:rFonts w:ascii="Arial" w:hAnsi="Arial" w:cs="Arial"/>
           <w:b/>
@@ -19044,37 +19076,19 @@
           <w:szCs w:val="24"/>
           <w:lang w:val="es-US"/>
         </w:rPr>
-        <w:t>Conclusión:</w:t>
-      </w:r>
-      <w:r>
-        <w:rPr>
-          <w:rFonts w:ascii="Arial" w:hAnsi="Arial" w:cs="Arial"/>
+      </w:pPr>
+    </w:p>
+    <w:p>
+      <w:pPr>
+        <w:rPr>
+          <w:rFonts w:ascii="Arial" w:hAnsi="Arial" w:cs="Arial"/>
+          <w:b/>
+          <w:bCs/>
           <w:sz w:val="24"/>
           <w:szCs w:val="24"/>
           <w:lang w:val="es-US"/>
         </w:rPr>
-        <w:t> El instituto </w:t>
-      </w:r>
-      <w:r>
-        <w:rPr>
-          <w:rFonts w:ascii="Arial" w:hAnsi="Arial" w:cs="Arial"/>
-          <w:b/>
-          <w:bCs/>
-          <w:sz w:val="24"/>
-          <w:szCs w:val="24"/>
-          <w:lang w:val="es-US"/>
-        </w:rPr>
-        <w:t>no cuenta con ninguna política o norma interna</w:t>
-      </w:r>
-      <w:r>
-        <w:rPr>
-          <w:rFonts w:ascii="Arial" w:hAnsi="Arial" w:cs="Arial"/>
-          <w:sz w:val="24"/>
-          <w:szCs w:val="24"/>
-          <w:lang w:val="es-US"/>
-        </w:rPr>
-        <w:t> formal relacionada con el uso de la red, el laboratorio o la seguridad de la información. La operación se basa en la buena voluntad y el sentido común.</w:t>
-      </w:r>
+      </w:pPr>
     </w:p>
     <w:p>
       <w:pPr>
@@ -29218,8 +29232,6 @@
                 <w:lang w:val="es-US"/>
               </w:rPr>
             </w:pPr>
-            <w:bookmarkStart w:id="0" w:name="_GoBack"/>
-            <w:bookmarkEnd w:id="0"/>
             <w:r>
               <w:rPr>
                 <w:rFonts w:ascii="Arial" w:hAnsi="Arial" w:cs="Arial"/>
@@ -32153,6 +32165,7 @@
   <w:style w:type="character" w:default="1" w:styleId="Fuentedeprrafopredeter">
     <w:name w:val="Default Paragraph Font"/>
     <w:uiPriority w:val="1"/>
+    <w:semiHidden/>
     <w:unhideWhenUsed/>
   </w:style>
   <w:style w:type="table" w:default="1" w:styleId="Tablanormal">

</xml_diff>

<commit_message>
Adding Etapas de desarrollo del plan de auditoria
</commit_message>
<xml_diff>
--- a/PROYECTO FINAL/AVANCE PRELIMINAR 1.1.docx
+++ b/PROYECTO FINAL/AVANCE PRELIMINAR 1.1.docx
@@ -2715,87 +2715,18 @@
           <w:sz w:val="24"/>
         </w:rPr>
       </w:pPr>
-      <w:bookmarkStart w:id="0" w:name="_Hlk227174734"/>
-      <w:bookmarkStart w:id="1" w:name="_Hlk227174816"/>
+      <w:bookmarkStart w:id="0" w:name="_Hlk227174816"/>
+      <w:bookmarkStart w:id="1" w:name="_Hlk227174734"/>
       <w:r>
         <w:rPr>
           <w:rFonts w:ascii="Arial" w:hAnsi="Arial" w:cs="Arial"/>
           <w:b/>
           <w:sz w:val="24"/>
         </w:rPr>
-        <w:t>MARCO</w:t>
-      </w:r>
-      <w:r>
-        <w:rPr>
-          <w:rFonts w:ascii="Arial" w:hAnsi="Arial" w:cs="Arial"/>
-          <w:b/>
-          <w:spacing w:val="-7"/>
-          <w:sz w:val="24"/>
-        </w:rPr>
-        <w:t xml:space="preserve"> </w:t>
-      </w:r>
-      <w:r>
-        <w:rPr>
-          <w:rFonts w:ascii="Arial" w:hAnsi="Arial" w:cs="Arial"/>
-          <w:b/>
-          <w:sz w:val="24"/>
-        </w:rPr>
-        <w:t>LEGAL</w:t>
-      </w:r>
-      <w:r>
-        <w:rPr>
-          <w:rFonts w:ascii="Arial" w:hAnsi="Arial" w:cs="Arial"/>
-          <w:b/>
-          <w:spacing w:val="-15"/>
-          <w:sz w:val="24"/>
-        </w:rPr>
-        <w:t xml:space="preserve"> </w:t>
-      </w:r>
-      <w:r>
-        <w:rPr>
-          <w:rFonts w:ascii="Arial" w:hAnsi="Arial" w:cs="Arial"/>
-          <w:b/>
-          <w:sz w:val="24"/>
-        </w:rPr>
-        <w:t>Y</w:t>
-      </w:r>
-      <w:r>
-        <w:rPr>
-          <w:rFonts w:ascii="Arial" w:hAnsi="Arial" w:cs="Arial"/>
-          <w:b/>
-          <w:spacing w:val="-10"/>
-          <w:sz w:val="24"/>
-        </w:rPr>
-        <w:t xml:space="preserve"> </w:t>
-      </w:r>
-      <w:r>
-        <w:rPr>
-          <w:rFonts w:ascii="Arial" w:hAnsi="Arial" w:cs="Arial"/>
-          <w:b/>
-          <w:sz w:val="24"/>
-        </w:rPr>
-        <w:t>NORMATIVO</w:t>
-      </w:r>
-      <w:r>
-        <w:rPr>
-          <w:rFonts w:ascii="Arial" w:hAnsi="Arial" w:cs="Arial"/>
-          <w:b/>
-          <w:spacing w:val="-13"/>
-          <w:sz w:val="24"/>
-        </w:rPr>
-        <w:t xml:space="preserve"> </w:t>
-      </w:r>
-      <w:r>
-        <w:rPr>
-          <w:rFonts w:ascii="Arial" w:hAnsi="Arial" w:cs="Arial"/>
-          <w:b/>
-          <w:spacing w:val="-2"/>
-          <w:sz w:val="24"/>
-        </w:rPr>
-        <w:t>APLICABLE</w:t>
+        <w:t>CRITERIO DE AUDITORIA</w:t>
       </w:r>
     </w:p>
-    <w:bookmarkEnd w:id="0"/>
+    <w:bookmarkEnd w:id="1"/>
     <w:p>
       <w:pPr>
         <w:tabs>
@@ -3465,8 +3396,6 @@
             <w:r>
               <w:rPr>
                 <w:rFonts w:ascii="Arial" w:eastAsia="Times New Roman" w:hAnsi="Arial" w:cs="Arial"/>
-                <w:i/>
-                <w:iCs/>
                 <w:color w:val="1F1F1F"/>
                 <w:kern w:val="0"/>
                 <w:sz w:val="24"/>
@@ -6339,7 +6268,27 @@
                 <w:szCs w:val="24"/>
                 <w:lang w:val="es-US"/>
               </w:rPr>
-              <w:t>Inventario y Estado del Hardware (23 Estaciones de Trabajo)ISO 19770-1, COBIT BAI09, Normas CGR</w:t>
+              <w:t xml:space="preserve">Inventario y Estado del Hardware (23 Estaciones de </w:t>
+            </w:r>
+            <w:proofErr w:type="gramStart"/>
+            <w:r>
+              <w:rPr>
+                <w:rFonts w:ascii="Arial" w:hAnsi="Arial" w:cs="Arial"/>
+                <w:sz w:val="24"/>
+                <w:szCs w:val="24"/>
+                <w:lang w:val="es-US"/>
+              </w:rPr>
+              <w:t>Trabajo)ISO</w:t>
+            </w:r>
+            <w:proofErr w:type="gramEnd"/>
+            <w:r>
+              <w:rPr>
+                <w:rFonts w:ascii="Arial" w:hAnsi="Arial" w:cs="Arial"/>
+                <w:sz w:val="24"/>
+                <w:szCs w:val="24"/>
+                <w:lang w:val="es-US"/>
+              </w:rPr>
+              <w:t xml:space="preserve"> 19770-1, COBIT BAI09, Normas CGR</w:t>
             </w:r>
           </w:p>
         </w:tc>
@@ -6372,7 +6321,27 @@
                 <w:szCs w:val="24"/>
                 <w:lang w:val="es-US"/>
               </w:rPr>
-              <w:t>Inventario y Estado del Hardware (23 Estaciones de Trabajo)ISO 19770-1, COBIT BAI09, Normas CGR</w:t>
+              <w:t xml:space="preserve">Inventario y Estado del Hardware (23 Estaciones de </w:t>
+            </w:r>
+            <w:proofErr w:type="gramStart"/>
+            <w:r>
+              <w:rPr>
+                <w:rFonts w:ascii="Arial" w:hAnsi="Arial" w:cs="Arial"/>
+                <w:sz w:val="24"/>
+                <w:szCs w:val="24"/>
+                <w:lang w:val="es-US"/>
+              </w:rPr>
+              <w:t>Trabajo)ISO</w:t>
+            </w:r>
+            <w:proofErr w:type="gramEnd"/>
+            <w:r>
+              <w:rPr>
+                <w:rFonts w:ascii="Arial" w:hAnsi="Arial" w:cs="Arial"/>
+                <w:sz w:val="24"/>
+                <w:szCs w:val="24"/>
+                <w:lang w:val="es-US"/>
+              </w:rPr>
+              <w:t xml:space="preserve"> 19770-1, COBIT BAI09, Normas CGR</w:t>
             </w:r>
           </w:p>
         </w:tc>
@@ -7013,7 +6982,7 @@
         </w:rPr>
       </w:pPr>
     </w:p>
-    <w:bookmarkEnd w:id="1"/>
+    <w:bookmarkEnd w:id="0"/>
     <w:p>
       <w:pPr>
         <w:tabs>
@@ -11326,7 +11295,27 @@
                 <w:szCs w:val="24"/>
                 <w:lang w:val="es-US"/>
               </w:rPr>
-              <w:t>Acceso a archivos del Director (PC administrativa)</w:t>
+              <w:t xml:space="preserve">Acceso a archivos del </w:t>
+            </w:r>
+            <w:proofErr w:type="gramStart"/>
+            <w:r>
+              <w:rPr>
+                <w:rFonts w:ascii="Arial" w:hAnsi="Arial" w:cs="Arial"/>
+                <w:sz w:val="24"/>
+                <w:szCs w:val="24"/>
+                <w:lang w:val="es-US"/>
+              </w:rPr>
+              <w:t>Director</w:t>
+            </w:r>
+            <w:proofErr w:type="gramEnd"/>
+            <w:r>
+              <w:rPr>
+                <w:rFonts w:ascii="Arial" w:hAnsi="Arial" w:cs="Arial"/>
+                <w:sz w:val="24"/>
+                <w:szCs w:val="24"/>
+                <w:lang w:val="es-US"/>
+              </w:rPr>
+              <w:t xml:space="preserve"> (PC administrativa)</w:t>
             </w:r>
           </w:p>
         </w:tc>
@@ -15594,6 +15583,7 @@
               <w:t xml:space="preserve"> </w:t>
             </w:r>
             <w:proofErr w:type="spellStart"/>
+            <w:proofErr w:type="gramStart"/>
             <w:r>
               <w:rPr>
                 <w:rFonts w:ascii="Arial" w:hAnsi="Arial" w:cs="Arial"/>
@@ -15603,6 +15593,7 @@
               <w:t>a</w:t>
             </w:r>
             <w:proofErr w:type="spellEnd"/>
+            <w:proofErr w:type="gramEnd"/>
             <w:r>
               <w:rPr>
                 <w:rFonts w:ascii="Arial" w:hAnsi="Arial" w:cs="Arial"/>
@@ -23659,7 +23650,25 @@
                 <w:sz w:val="24"/>
                 <w:szCs w:val="24"/>
               </w:rPr>
-              <w:t xml:space="preserve"> a </w:t>
+              <w:t xml:space="preserve"> </w:t>
+            </w:r>
+            <w:proofErr w:type="gramStart"/>
+            <w:r>
+              <w:rPr>
+                <w:rFonts w:ascii="Arial" w:hAnsi="Arial" w:cs="Arial"/>
+                <w:sz w:val="24"/>
+                <w:szCs w:val="24"/>
+              </w:rPr>
+              <w:t>a</w:t>
+            </w:r>
+            <w:proofErr w:type="gramEnd"/>
+            <w:r>
+              <w:rPr>
+                <w:rFonts w:ascii="Arial" w:hAnsi="Arial" w:cs="Arial"/>
+                <w:sz w:val="24"/>
+                <w:szCs w:val="24"/>
+              </w:rPr>
+              <w:t xml:space="preserve"> </w:t>
             </w:r>
             <w:proofErr w:type="spellStart"/>
             <w:r>
@@ -23951,8 +23960,19 @@
                 <w:szCs w:val="24"/>
                 <w:lang w:val="es-US"/>
               </w:rPr>
-              <w:t>Acceso no autorizado a datos del Director</w:t>
-            </w:r>
+              <w:t xml:space="preserve">Acceso no autorizado a datos del </w:t>
+            </w:r>
+            <w:proofErr w:type="gramStart"/>
+            <w:r>
+              <w:rPr>
+                <w:rFonts w:ascii="Arial" w:hAnsi="Arial" w:cs="Arial"/>
+                <w:sz w:val="24"/>
+                <w:szCs w:val="24"/>
+                <w:lang w:val="es-US"/>
+              </w:rPr>
+              <w:t>Director</w:t>
+            </w:r>
+            <w:proofErr w:type="gramEnd"/>
           </w:p>
         </w:tc>
         <w:tc>
@@ -27646,8 +27666,19 @@
                 <w:szCs w:val="24"/>
                 <w:lang w:val="es-US"/>
               </w:rPr>
-              <w:t>Acceso no autorizado a datos del Director</w:t>
-            </w:r>
+              <w:t xml:space="preserve">Acceso no autorizado a datos del </w:t>
+            </w:r>
+            <w:proofErr w:type="gramStart"/>
+            <w:r>
+              <w:rPr>
+                <w:rFonts w:ascii="Arial" w:hAnsi="Arial" w:cs="Arial"/>
+                <w:sz w:val="24"/>
+                <w:szCs w:val="24"/>
+                <w:lang w:val="es-US"/>
+              </w:rPr>
+              <w:t>Director</w:t>
+            </w:r>
+            <w:proofErr w:type="gramEnd"/>
           </w:p>
         </w:tc>
         <w:tc>
@@ -31519,7 +31550,27 @@
                 <w:szCs w:val="24"/>
                 <w:lang w:val="es-US"/>
               </w:rPr>
-              <w:t>R-03 (Acceso a datos del Director)</w:t>
+              <w:t xml:space="preserve">R-03 (Acceso a datos del </w:t>
+            </w:r>
+            <w:proofErr w:type="gramStart"/>
+            <w:r>
+              <w:rPr>
+                <w:rFonts w:ascii="Arial" w:hAnsi="Arial" w:cs="Arial"/>
+                <w:sz w:val="24"/>
+                <w:szCs w:val="24"/>
+                <w:lang w:val="es-US"/>
+              </w:rPr>
+              <w:t>Director</w:t>
+            </w:r>
+            <w:proofErr w:type="gramEnd"/>
+            <w:r>
+              <w:rPr>
+                <w:rFonts w:ascii="Arial" w:hAnsi="Arial" w:cs="Arial"/>
+                <w:sz w:val="24"/>
+                <w:szCs w:val="24"/>
+                <w:lang w:val="es-US"/>
+              </w:rPr>
+              <w:t>)</w:t>
             </w:r>
           </w:p>
         </w:tc>
@@ -35231,8 +35282,21 @@
                 <w:szCs w:val="24"/>
                 <w:lang w:val="es-US"/>
               </w:rPr>
-              <w:t>Pérdida de datos del Director</w:t>
-            </w:r>
+              <w:t xml:space="preserve">Pérdida de datos del </w:t>
+            </w:r>
+            <w:proofErr w:type="gramStart"/>
+            <w:r>
+              <w:rPr>
+                <w:rFonts w:ascii="Arial" w:hAnsi="Arial" w:cs="Arial"/>
+                <w:b/>
+                <w:bCs/>
+                <w:sz w:val="24"/>
+                <w:szCs w:val="24"/>
+                <w:lang w:val="es-US"/>
+              </w:rPr>
+              <w:t>Director</w:t>
+            </w:r>
+            <w:proofErr w:type="gramEnd"/>
           </w:p>
         </w:tc>
         <w:tc>
@@ -36291,6 +36355,8 @@
       <w:pPr>
         <w:rPr>
           <w:rFonts w:ascii="Arial" w:hAnsi="Arial" w:cs="Arial"/>
+          <w:b/>
+          <w:bCs/>
           <w:sz w:val="24"/>
           <w:szCs w:val="24"/>
           <w:lang w:val="es-US"/>
@@ -36299,6 +36365,8 @@
       <w:r>
         <w:rPr>
           <w:rFonts w:ascii="Arial" w:hAnsi="Arial" w:cs="Arial"/>
+          <w:b/>
+          <w:bCs/>
           <w:sz w:val="24"/>
           <w:szCs w:val="24"/>
           <w:lang w:val="es-US"/>
@@ -36307,6 +36375,3020 @@
         <w:t>IX. TRABAJO DE AUDITORÍA</w:t>
       </w:r>
     </w:p>
+    <w:p>
+      <w:pPr>
+        <w:rPr>
+          <w:rFonts w:ascii="Arial" w:hAnsi="Arial" w:cs="Arial"/>
+          <w:b/>
+          <w:bCs/>
+          <w:sz w:val="24"/>
+          <w:szCs w:val="24"/>
+          <w:lang w:val="es-US"/>
+        </w:rPr>
+      </w:pPr>
+    </w:p>
+    <w:p>
+      <w:pPr>
+        <w:rPr>
+          <w:rFonts w:ascii="Arial" w:hAnsi="Arial" w:cs="Arial"/>
+          <w:b/>
+          <w:bCs/>
+          <w:sz w:val="24"/>
+          <w:szCs w:val="24"/>
+          <w:lang w:val="es-US"/>
+        </w:rPr>
+      </w:pPr>
+      <w:r>
+        <w:rPr>
+          <w:rFonts w:ascii="Arial" w:hAnsi="Arial" w:cs="Arial"/>
+          <w:b/>
+          <w:bCs/>
+          <w:sz w:val="24"/>
+          <w:szCs w:val="24"/>
+          <w:lang w:val="es-US"/>
+        </w:rPr>
+        <w:t>ETAPAS DE DESARROLLO DE LA AUDITORÍA DE REDES Y HARDWARE</w:t>
+      </w:r>
+    </w:p>
+    <w:tbl>
+      <w:tblPr>
+        <w:tblW w:w="11610" w:type="dxa"/>
+        <w:tblInd w:w="-1265" w:type="dxa"/>
+        <w:tblBorders>
+          <w:top w:val="single" w:sz="4" w:space="0" w:color="auto"/>
+          <w:left w:val="single" w:sz="4" w:space="0" w:color="auto"/>
+          <w:bottom w:val="single" w:sz="4" w:space="0" w:color="auto"/>
+          <w:right w:val="single" w:sz="4" w:space="0" w:color="auto"/>
+          <w:insideH w:val="single" w:sz="4" w:space="0" w:color="auto"/>
+          <w:insideV w:val="single" w:sz="4" w:space="0" w:color="auto"/>
+        </w:tblBorders>
+        <w:tblLayout w:type="fixed"/>
+        <w:tblCellMar>
+          <w:top w:w="15" w:type="dxa"/>
+          <w:left w:w="15" w:type="dxa"/>
+          <w:bottom w:w="15" w:type="dxa"/>
+          <w:right w:w="15" w:type="dxa"/>
+        </w:tblCellMar>
+        <w:tblLook w:val="04A0" w:firstRow="1" w:lastRow="0" w:firstColumn="1" w:lastColumn="0" w:noHBand="0" w:noVBand="1"/>
+      </w:tblPr>
+      <w:tblGrid>
+        <w:gridCol w:w="1618"/>
+        <w:gridCol w:w="2267"/>
+        <w:gridCol w:w="3135"/>
+        <w:gridCol w:w="2261"/>
+        <w:gridCol w:w="2329"/>
+      </w:tblGrid>
+      <w:tr>
+        <w:trPr>
+          <w:tblHeader/>
+        </w:trPr>
+        <w:tc>
+          <w:tcPr>
+            <w:tcW w:w="1618" w:type="dxa"/>
+            <w:tcMar>
+              <w:top w:w="150" w:type="dxa"/>
+              <w:left w:w="0" w:type="dxa"/>
+              <w:bottom w:w="150" w:type="dxa"/>
+              <w:right w:w="240" w:type="dxa"/>
+            </w:tcMar>
+            <w:vAlign w:val="center"/>
+            <w:hideMark/>
+          </w:tcPr>
+          <w:p>
+            <w:pPr>
+              <w:spacing w:after="0" w:line="375" w:lineRule="atLeast"/>
+              <w:rPr>
+                <w:rFonts w:ascii="Segoe UI" w:eastAsia="Times New Roman" w:hAnsi="Segoe UI" w:cs="Segoe UI"/>
+                <w:kern w:val="0"/>
+                <w:sz w:val="23"/>
+                <w:szCs w:val="23"/>
+                <w:lang w:val="es-US" w:eastAsia="es-US"/>
+                <w14:ligatures w14:val="none"/>
+              </w:rPr>
+            </w:pPr>
+            <w:r>
+              <w:rPr>
+                <w:rFonts w:ascii="Segoe UI" w:eastAsia="Times New Roman" w:hAnsi="Segoe UI" w:cs="Segoe UI"/>
+                <w:b/>
+                <w:bCs/>
+                <w:kern w:val="0"/>
+                <w:sz w:val="23"/>
+                <w:szCs w:val="23"/>
+                <w:lang w:val="es-US" w:eastAsia="es-US"/>
+                <w14:ligatures w14:val="none"/>
+              </w:rPr>
+              <w:t>Fase</w:t>
+            </w:r>
+          </w:p>
+        </w:tc>
+        <w:tc>
+          <w:tcPr>
+            <w:tcW w:w="2267" w:type="dxa"/>
+            <w:tcMar>
+              <w:top w:w="150" w:type="dxa"/>
+              <w:left w:w="240" w:type="dxa"/>
+              <w:bottom w:w="150" w:type="dxa"/>
+              <w:right w:w="240" w:type="dxa"/>
+            </w:tcMar>
+            <w:vAlign w:val="center"/>
+            <w:hideMark/>
+          </w:tcPr>
+          <w:p>
+            <w:pPr>
+              <w:spacing w:after="0" w:line="375" w:lineRule="atLeast"/>
+              <w:rPr>
+                <w:rFonts w:ascii="Segoe UI" w:eastAsia="Times New Roman" w:hAnsi="Segoe UI" w:cs="Segoe UI"/>
+                <w:kern w:val="0"/>
+                <w:sz w:val="23"/>
+                <w:szCs w:val="23"/>
+                <w:lang w:val="es-US" w:eastAsia="es-US"/>
+                <w14:ligatures w14:val="none"/>
+              </w:rPr>
+            </w:pPr>
+            <w:r>
+              <w:rPr>
+                <w:rFonts w:ascii="Segoe UI" w:eastAsia="Times New Roman" w:hAnsi="Segoe UI" w:cs="Segoe UI"/>
+                <w:b/>
+                <w:bCs/>
+                <w:kern w:val="0"/>
+                <w:sz w:val="23"/>
+                <w:szCs w:val="23"/>
+                <w:lang w:val="es-US" w:eastAsia="es-US"/>
+                <w14:ligatures w14:val="none"/>
+              </w:rPr>
+              <w:t>Objetivo</w:t>
+            </w:r>
+          </w:p>
+        </w:tc>
+        <w:tc>
+          <w:tcPr>
+            <w:tcW w:w="3135" w:type="dxa"/>
+            <w:tcMar>
+              <w:top w:w="150" w:type="dxa"/>
+              <w:left w:w="240" w:type="dxa"/>
+              <w:bottom w:w="150" w:type="dxa"/>
+              <w:right w:w="240" w:type="dxa"/>
+            </w:tcMar>
+            <w:vAlign w:val="center"/>
+            <w:hideMark/>
+          </w:tcPr>
+          <w:p>
+            <w:pPr>
+              <w:spacing w:after="0" w:line="375" w:lineRule="atLeast"/>
+              <w:rPr>
+                <w:rFonts w:ascii="Segoe UI" w:eastAsia="Times New Roman" w:hAnsi="Segoe UI" w:cs="Segoe UI"/>
+                <w:kern w:val="0"/>
+                <w:sz w:val="23"/>
+                <w:szCs w:val="23"/>
+                <w:lang w:val="es-US" w:eastAsia="es-US"/>
+                <w14:ligatures w14:val="none"/>
+              </w:rPr>
+            </w:pPr>
+            <w:r>
+              <w:rPr>
+                <w:rFonts w:ascii="Segoe UI" w:eastAsia="Times New Roman" w:hAnsi="Segoe UI" w:cs="Segoe UI"/>
+                <w:b/>
+                <w:bCs/>
+                <w:kern w:val="0"/>
+                <w:sz w:val="23"/>
+                <w:szCs w:val="23"/>
+                <w:lang w:val="es-US" w:eastAsia="es-US"/>
+                <w14:ligatures w14:val="none"/>
+              </w:rPr>
+              <w:t>Actividades Principales</w:t>
+            </w:r>
+          </w:p>
+        </w:tc>
+        <w:tc>
+          <w:tcPr>
+            <w:tcW w:w="2261" w:type="dxa"/>
+            <w:tcMar>
+              <w:top w:w="150" w:type="dxa"/>
+              <w:left w:w="240" w:type="dxa"/>
+              <w:bottom w:w="150" w:type="dxa"/>
+              <w:right w:w="240" w:type="dxa"/>
+            </w:tcMar>
+            <w:vAlign w:val="center"/>
+            <w:hideMark/>
+          </w:tcPr>
+          <w:p>
+            <w:pPr>
+              <w:spacing w:after="0" w:line="375" w:lineRule="atLeast"/>
+              <w:rPr>
+                <w:rFonts w:ascii="Segoe UI" w:eastAsia="Times New Roman" w:hAnsi="Segoe UI" w:cs="Segoe UI"/>
+                <w:kern w:val="0"/>
+                <w:sz w:val="23"/>
+                <w:szCs w:val="23"/>
+                <w:lang w:val="es-US" w:eastAsia="es-US"/>
+                <w14:ligatures w14:val="none"/>
+              </w:rPr>
+            </w:pPr>
+            <w:r>
+              <w:rPr>
+                <w:rFonts w:ascii="Segoe UI" w:eastAsia="Times New Roman" w:hAnsi="Segoe UI" w:cs="Segoe UI"/>
+                <w:b/>
+                <w:bCs/>
+                <w:kern w:val="0"/>
+                <w:sz w:val="23"/>
+                <w:szCs w:val="23"/>
+                <w:lang w:val="es-US" w:eastAsia="es-US"/>
+                <w14:ligatures w14:val="none"/>
+              </w:rPr>
+              <w:t>Responsables</w:t>
+            </w:r>
+          </w:p>
+        </w:tc>
+        <w:tc>
+          <w:tcPr>
+            <w:tcW w:w="2329" w:type="dxa"/>
+            <w:tcMar>
+              <w:top w:w="150" w:type="dxa"/>
+              <w:left w:w="240" w:type="dxa"/>
+              <w:bottom w:w="150" w:type="dxa"/>
+              <w:right w:w="240" w:type="dxa"/>
+            </w:tcMar>
+            <w:vAlign w:val="center"/>
+            <w:hideMark/>
+          </w:tcPr>
+          <w:p>
+            <w:pPr>
+              <w:spacing w:after="0" w:line="375" w:lineRule="atLeast"/>
+              <w:rPr>
+                <w:rFonts w:ascii="Segoe UI" w:eastAsia="Times New Roman" w:hAnsi="Segoe UI" w:cs="Segoe UI"/>
+                <w:kern w:val="0"/>
+                <w:sz w:val="23"/>
+                <w:szCs w:val="23"/>
+                <w:lang w:val="es-US" w:eastAsia="es-US"/>
+                <w14:ligatures w14:val="none"/>
+              </w:rPr>
+            </w:pPr>
+            <w:r>
+              <w:rPr>
+                <w:rFonts w:ascii="Segoe UI" w:eastAsia="Times New Roman" w:hAnsi="Segoe UI" w:cs="Segoe UI"/>
+                <w:b/>
+                <w:bCs/>
+                <w:kern w:val="0"/>
+                <w:sz w:val="23"/>
+                <w:szCs w:val="23"/>
+                <w:lang w:val="es-US" w:eastAsia="es-US"/>
+                <w14:ligatures w14:val="none"/>
+              </w:rPr>
+              <w:t>Perfil del Auditor</w:t>
+            </w:r>
+          </w:p>
+        </w:tc>
+      </w:tr>
+      <w:tr>
+        <w:tc>
+          <w:tcPr>
+            <w:tcW w:w="1618" w:type="dxa"/>
+            <w:tcMar>
+              <w:top w:w="150" w:type="dxa"/>
+              <w:left w:w="0" w:type="dxa"/>
+              <w:bottom w:w="150" w:type="dxa"/>
+              <w:right w:w="240" w:type="dxa"/>
+            </w:tcMar>
+            <w:vAlign w:val="center"/>
+            <w:hideMark/>
+          </w:tcPr>
+          <w:p>
+            <w:pPr>
+              <w:spacing w:after="0" w:line="375" w:lineRule="atLeast"/>
+              <w:rPr>
+                <w:rFonts w:ascii="Segoe UI" w:eastAsia="Times New Roman" w:hAnsi="Segoe UI" w:cs="Segoe UI"/>
+                <w:kern w:val="0"/>
+                <w:sz w:val="23"/>
+                <w:szCs w:val="23"/>
+                <w:lang w:val="es-US" w:eastAsia="es-US"/>
+                <w14:ligatures w14:val="none"/>
+              </w:rPr>
+            </w:pPr>
+            <w:r>
+              <w:rPr>
+                <w:rFonts w:ascii="Segoe UI" w:eastAsia="Times New Roman" w:hAnsi="Segoe UI" w:cs="Segoe UI"/>
+                <w:b/>
+                <w:bCs/>
+                <w:kern w:val="0"/>
+                <w:sz w:val="23"/>
+                <w:szCs w:val="23"/>
+                <w:lang w:val="es-US" w:eastAsia="es-US"/>
+                <w14:ligatures w14:val="none"/>
+              </w:rPr>
+              <w:t>I. Planificación</w:t>
+            </w:r>
+          </w:p>
+        </w:tc>
+        <w:tc>
+          <w:tcPr>
+            <w:tcW w:w="2267" w:type="dxa"/>
+            <w:tcMar>
+              <w:top w:w="150" w:type="dxa"/>
+              <w:left w:w="240" w:type="dxa"/>
+              <w:bottom w:w="150" w:type="dxa"/>
+              <w:right w:w="240" w:type="dxa"/>
+            </w:tcMar>
+            <w:vAlign w:val="center"/>
+            <w:hideMark/>
+          </w:tcPr>
+          <w:p>
+            <w:pPr>
+              <w:spacing w:after="0" w:line="375" w:lineRule="atLeast"/>
+              <w:rPr>
+                <w:rFonts w:ascii="Segoe UI" w:eastAsia="Times New Roman" w:hAnsi="Segoe UI" w:cs="Segoe UI"/>
+                <w:kern w:val="0"/>
+                <w:sz w:val="23"/>
+                <w:szCs w:val="23"/>
+                <w:lang w:val="es-US" w:eastAsia="es-US"/>
+                <w14:ligatures w14:val="none"/>
+              </w:rPr>
+            </w:pPr>
+            <w:r>
+              <w:rPr>
+                <w:rFonts w:ascii="Segoe UI" w:eastAsia="Times New Roman" w:hAnsi="Segoe UI" w:cs="Segoe UI"/>
+                <w:kern w:val="0"/>
+                <w:sz w:val="23"/>
+                <w:szCs w:val="23"/>
+                <w:lang w:val="es-US" w:eastAsia="es-US"/>
+                <w14:ligatures w14:val="none"/>
+              </w:rPr>
+              <w:t>Establecer las bases técnicas y organizativas para una auditoría eficiente de la infraestructura de red y hardware del Instituto.</w:t>
+            </w:r>
+          </w:p>
+        </w:tc>
+        <w:tc>
+          <w:tcPr>
+            <w:tcW w:w="3135" w:type="dxa"/>
+            <w:tcMar>
+              <w:top w:w="150" w:type="dxa"/>
+              <w:left w:w="240" w:type="dxa"/>
+              <w:bottom w:w="150" w:type="dxa"/>
+              <w:right w:w="240" w:type="dxa"/>
+            </w:tcMar>
+            <w:vAlign w:val="center"/>
+            <w:hideMark/>
+          </w:tcPr>
+          <w:p>
+            <w:pPr>
+              <w:spacing w:after="0" w:line="375" w:lineRule="atLeast"/>
+              <w:rPr>
+                <w:rFonts w:ascii="Segoe UI" w:eastAsia="Times New Roman" w:hAnsi="Segoe UI" w:cs="Segoe UI"/>
+                <w:kern w:val="0"/>
+                <w:sz w:val="23"/>
+                <w:szCs w:val="23"/>
+                <w:lang w:val="es-US" w:eastAsia="es-US"/>
+                <w14:ligatures w14:val="none"/>
+              </w:rPr>
+            </w:pPr>
+            <w:r>
+              <w:rPr>
+                <w:rFonts w:ascii="Segoe UI" w:eastAsia="Times New Roman" w:hAnsi="Segoe UI" w:cs="Segoe UI"/>
+                <w:kern w:val="0"/>
+                <w:sz w:val="23"/>
+                <w:szCs w:val="23"/>
+                <w:lang w:val="es-US" w:eastAsia="es-US"/>
+                <w14:ligatures w14:val="none"/>
+              </w:rPr>
+              <w:t>- Definir alcance, objetivos y criterios de auditoría (red y hardware).</w:t>
+            </w:r>
+            <w:r>
+              <w:rPr>
+                <w:rFonts w:ascii="Segoe UI" w:eastAsia="Times New Roman" w:hAnsi="Segoe UI" w:cs="Segoe UI"/>
+                <w:kern w:val="0"/>
+                <w:sz w:val="23"/>
+                <w:szCs w:val="23"/>
+                <w:lang w:val="es-US" w:eastAsia="es-US"/>
+                <w14:ligatures w14:val="none"/>
+              </w:rPr>
+              <w:br/>
+              <w:t>- Elaborar cronograma de trabajo detallado (45 días hábiles).</w:t>
+            </w:r>
+            <w:r>
+              <w:rPr>
+                <w:rFonts w:ascii="Segoe UI" w:eastAsia="Times New Roman" w:hAnsi="Segoe UI" w:cs="Segoe UI"/>
+                <w:kern w:val="0"/>
+                <w:sz w:val="23"/>
+                <w:szCs w:val="23"/>
+                <w:lang w:val="es-US" w:eastAsia="es-US"/>
+                <w14:ligatures w14:val="none"/>
+              </w:rPr>
+              <w:br/>
+              <w:t>- Revisión de documentación inicial (políticas, inventarios, diagramas de red si existen).</w:t>
+            </w:r>
+            <w:r>
+              <w:rPr>
+                <w:rFonts w:ascii="Segoe UI" w:eastAsia="Times New Roman" w:hAnsi="Segoe UI" w:cs="Segoe UI"/>
+                <w:kern w:val="0"/>
+                <w:sz w:val="23"/>
+                <w:szCs w:val="23"/>
+                <w:lang w:val="es-US" w:eastAsia="es-US"/>
+                <w14:ligatures w14:val="none"/>
+              </w:rPr>
+              <w:br/>
+              <w:t>- Diseño de instrumentos de auditoría (</w:t>
+            </w:r>
+            <w:proofErr w:type="spellStart"/>
+            <w:r>
+              <w:rPr>
+                <w:rFonts w:ascii="Segoe UI" w:eastAsia="Times New Roman" w:hAnsi="Segoe UI" w:cs="Segoe UI"/>
+                <w:kern w:val="0"/>
+                <w:sz w:val="23"/>
+                <w:szCs w:val="23"/>
+                <w:lang w:val="es-US" w:eastAsia="es-US"/>
+                <w14:ligatures w14:val="none"/>
+              </w:rPr>
+              <w:t>checklists</w:t>
+            </w:r>
+            <w:proofErr w:type="spellEnd"/>
+            <w:r>
+              <w:rPr>
+                <w:rFonts w:ascii="Segoe UI" w:eastAsia="Times New Roman" w:hAnsi="Segoe UI" w:cs="Segoe UI"/>
+                <w:kern w:val="0"/>
+                <w:sz w:val="23"/>
+                <w:szCs w:val="23"/>
+                <w:lang w:val="es-US" w:eastAsia="es-US"/>
+                <w14:ligatures w14:val="none"/>
+              </w:rPr>
+              <w:t xml:space="preserve"> Módulos I a V, cuestionario de 30 preguntas para el </w:t>
+            </w:r>
+            <w:proofErr w:type="gramStart"/>
+            <w:r>
+              <w:rPr>
+                <w:rFonts w:ascii="Segoe UI" w:eastAsia="Times New Roman" w:hAnsi="Segoe UI" w:cs="Segoe UI"/>
+                <w:kern w:val="0"/>
+                <w:sz w:val="23"/>
+                <w:szCs w:val="23"/>
+                <w:lang w:val="es-US" w:eastAsia="es-US"/>
+                <w14:ligatures w14:val="none"/>
+              </w:rPr>
+              <w:t>Director</w:t>
+            </w:r>
+            <w:proofErr w:type="gramEnd"/>
+            <w:r>
+              <w:rPr>
+                <w:rFonts w:ascii="Segoe UI" w:eastAsia="Times New Roman" w:hAnsi="Segoe UI" w:cs="Segoe UI"/>
+                <w:kern w:val="0"/>
+                <w:sz w:val="23"/>
+                <w:szCs w:val="23"/>
+                <w:lang w:val="es-US" w:eastAsia="es-US"/>
+                <w14:ligatures w14:val="none"/>
+              </w:rPr>
+              <w:t>).</w:t>
+            </w:r>
+            <w:r>
+              <w:rPr>
+                <w:rFonts w:ascii="Segoe UI" w:eastAsia="Times New Roman" w:hAnsi="Segoe UI" w:cs="Segoe UI"/>
+                <w:kern w:val="0"/>
+                <w:sz w:val="23"/>
+                <w:szCs w:val="23"/>
+                <w:lang w:val="es-US" w:eastAsia="es-US"/>
+                <w14:ligatures w14:val="none"/>
+              </w:rPr>
+              <w:br/>
+              <w:t>- Coordinación logística con el Instituto y reunión de apertura con el Director.</w:t>
+            </w:r>
+          </w:p>
+        </w:tc>
+        <w:tc>
+          <w:tcPr>
+            <w:tcW w:w="2261" w:type="dxa"/>
+            <w:tcMar>
+              <w:top w:w="150" w:type="dxa"/>
+              <w:left w:w="240" w:type="dxa"/>
+              <w:bottom w:w="150" w:type="dxa"/>
+              <w:right w:w="240" w:type="dxa"/>
+            </w:tcMar>
+            <w:vAlign w:val="center"/>
+            <w:hideMark/>
+          </w:tcPr>
+          <w:p>
+            <w:pPr>
+              <w:spacing w:after="0" w:line="375" w:lineRule="atLeast"/>
+              <w:rPr>
+                <w:rFonts w:ascii="Segoe UI" w:eastAsia="Times New Roman" w:hAnsi="Segoe UI" w:cs="Segoe UI"/>
+                <w:kern w:val="0"/>
+                <w:sz w:val="23"/>
+                <w:szCs w:val="23"/>
+                <w:lang w:val="es-US" w:eastAsia="es-US"/>
+                <w14:ligatures w14:val="none"/>
+              </w:rPr>
+            </w:pPr>
+            <w:r>
+              <w:rPr>
+                <w:rFonts w:ascii="Segoe UI" w:eastAsia="Times New Roman" w:hAnsi="Segoe UI" w:cs="Segoe UI"/>
+                <w:b/>
+                <w:bCs/>
+                <w:kern w:val="0"/>
+                <w:sz w:val="23"/>
+                <w:szCs w:val="23"/>
+                <w:lang w:val="es-US" w:eastAsia="es-US"/>
+                <w14:ligatures w14:val="none"/>
+              </w:rPr>
+              <w:t>Auditor Líder:</w:t>
+            </w:r>
+            <w:r>
+              <w:rPr>
+                <w:rFonts w:ascii="Segoe UI" w:eastAsia="Times New Roman" w:hAnsi="Segoe UI" w:cs="Segoe UI"/>
+                <w:kern w:val="0"/>
+                <w:sz w:val="23"/>
+                <w:szCs w:val="23"/>
+                <w:lang w:val="es-US" w:eastAsia="es-US"/>
+                <w14:ligatures w14:val="none"/>
+              </w:rPr>
+              <w:t> Br. Gerson Antonio Valdivia</w:t>
+            </w:r>
+            <w:r>
+              <w:rPr>
+                <w:rFonts w:ascii="Segoe UI" w:eastAsia="Times New Roman" w:hAnsi="Segoe UI" w:cs="Segoe UI"/>
+                <w:kern w:val="0"/>
+                <w:sz w:val="23"/>
+                <w:szCs w:val="23"/>
+                <w:lang w:val="es-US" w:eastAsia="es-US"/>
+                <w14:ligatures w14:val="none"/>
+              </w:rPr>
+              <w:br/>
+            </w:r>
+            <w:r>
+              <w:rPr>
+                <w:rFonts w:ascii="Segoe UI" w:eastAsia="Times New Roman" w:hAnsi="Segoe UI" w:cs="Segoe UI"/>
+                <w:b/>
+                <w:bCs/>
+                <w:kern w:val="0"/>
+                <w:sz w:val="23"/>
+                <w:szCs w:val="23"/>
+                <w:lang w:val="es-US" w:eastAsia="es-US"/>
+                <w14:ligatures w14:val="none"/>
+              </w:rPr>
+              <w:t>Auditor Administrativo:</w:t>
+            </w:r>
+            <w:r>
+              <w:rPr>
+                <w:rFonts w:ascii="Segoe UI" w:eastAsia="Times New Roman" w:hAnsi="Segoe UI" w:cs="Segoe UI"/>
+                <w:kern w:val="0"/>
+                <w:sz w:val="23"/>
+                <w:szCs w:val="23"/>
+                <w:lang w:val="es-US" w:eastAsia="es-US"/>
+                <w14:ligatures w14:val="none"/>
+              </w:rPr>
+              <w:t xml:space="preserve"> Br. Alison Michelle Navarro </w:t>
+            </w:r>
+            <w:proofErr w:type="spellStart"/>
+            <w:r>
+              <w:rPr>
+                <w:rFonts w:ascii="Segoe UI" w:eastAsia="Times New Roman" w:hAnsi="Segoe UI" w:cs="Segoe UI"/>
+                <w:kern w:val="0"/>
+                <w:sz w:val="23"/>
+                <w:szCs w:val="23"/>
+                <w:lang w:val="es-US" w:eastAsia="es-US"/>
+                <w14:ligatures w14:val="none"/>
+              </w:rPr>
+              <w:t>Goussen</w:t>
+            </w:r>
+            <w:proofErr w:type="spellEnd"/>
+            <w:r>
+              <w:rPr>
+                <w:rFonts w:ascii="Segoe UI" w:eastAsia="Times New Roman" w:hAnsi="Segoe UI" w:cs="Segoe UI"/>
+                <w:kern w:val="0"/>
+                <w:sz w:val="23"/>
+                <w:szCs w:val="23"/>
+                <w:lang w:val="es-US" w:eastAsia="es-US"/>
+                <w14:ligatures w14:val="none"/>
+              </w:rPr>
+              <w:br/>
+            </w:r>
+            <w:r>
+              <w:rPr>
+                <w:rFonts w:ascii="Segoe UI" w:eastAsia="Times New Roman" w:hAnsi="Segoe UI" w:cs="Segoe UI"/>
+                <w:b/>
+                <w:bCs/>
+                <w:kern w:val="0"/>
+                <w:sz w:val="23"/>
+                <w:szCs w:val="23"/>
+                <w:lang w:val="es-US" w:eastAsia="es-US"/>
+                <w14:ligatures w14:val="none"/>
+              </w:rPr>
+              <w:t>Documentalista:</w:t>
+            </w:r>
+            <w:r>
+              <w:rPr>
+                <w:rFonts w:ascii="Segoe UI" w:eastAsia="Times New Roman" w:hAnsi="Segoe UI" w:cs="Segoe UI"/>
+                <w:kern w:val="0"/>
+                <w:sz w:val="23"/>
+                <w:szCs w:val="23"/>
+                <w:lang w:val="es-US" w:eastAsia="es-US"/>
+                <w14:ligatures w14:val="none"/>
+              </w:rPr>
+              <w:t> Br. Arleth del Rosario Velásquez Gómez</w:t>
+            </w:r>
+          </w:p>
+        </w:tc>
+        <w:tc>
+          <w:tcPr>
+            <w:tcW w:w="2329" w:type="dxa"/>
+            <w:tcMar>
+              <w:top w:w="150" w:type="dxa"/>
+              <w:left w:w="240" w:type="dxa"/>
+              <w:bottom w:w="150" w:type="dxa"/>
+              <w:right w:w="0" w:type="dxa"/>
+            </w:tcMar>
+            <w:vAlign w:val="center"/>
+            <w:hideMark/>
+          </w:tcPr>
+          <w:p>
+            <w:pPr>
+              <w:spacing w:after="0" w:line="375" w:lineRule="atLeast"/>
+              <w:rPr>
+                <w:rFonts w:ascii="Segoe UI" w:eastAsia="Times New Roman" w:hAnsi="Segoe UI" w:cs="Segoe UI"/>
+                <w:kern w:val="0"/>
+                <w:sz w:val="23"/>
+                <w:szCs w:val="23"/>
+                <w:lang w:val="es-US" w:eastAsia="es-US"/>
+                <w14:ligatures w14:val="none"/>
+              </w:rPr>
+            </w:pPr>
+            <w:r>
+              <w:rPr>
+                <w:rFonts w:ascii="Segoe UI" w:eastAsia="Times New Roman" w:hAnsi="Segoe UI" w:cs="Segoe UI"/>
+                <w:kern w:val="0"/>
+                <w:sz w:val="23"/>
+                <w:szCs w:val="23"/>
+                <w:lang w:val="es-US" w:eastAsia="es-US"/>
+                <w14:ligatures w14:val="none"/>
+              </w:rPr>
+              <w:t>Profesionales con experiencia en auditoría de infraestructura tecnológica, estándares ISO/IEC 27001, estándares TIA/EIA, marco COBIT 2019, gestión documental y planificación de auditorías. Liderazgo, comunicación asertiva y capacidad de coordinación son clave.</w:t>
+            </w:r>
+          </w:p>
+        </w:tc>
+      </w:tr>
+      <w:tr>
+        <w:tc>
+          <w:tcPr>
+            <w:tcW w:w="1618" w:type="dxa"/>
+            <w:tcMar>
+              <w:top w:w="150" w:type="dxa"/>
+              <w:left w:w="0" w:type="dxa"/>
+              <w:bottom w:w="150" w:type="dxa"/>
+              <w:right w:w="240" w:type="dxa"/>
+            </w:tcMar>
+            <w:vAlign w:val="center"/>
+            <w:hideMark/>
+          </w:tcPr>
+          <w:p>
+            <w:pPr>
+              <w:spacing w:after="0" w:line="375" w:lineRule="atLeast"/>
+              <w:rPr>
+                <w:rFonts w:ascii="Segoe UI" w:eastAsia="Times New Roman" w:hAnsi="Segoe UI" w:cs="Segoe UI"/>
+                <w:kern w:val="0"/>
+                <w:sz w:val="23"/>
+                <w:szCs w:val="23"/>
+                <w:lang w:val="es-US" w:eastAsia="es-US"/>
+                <w14:ligatures w14:val="none"/>
+              </w:rPr>
+            </w:pPr>
+            <w:r>
+              <w:rPr>
+                <w:rFonts w:ascii="Segoe UI" w:eastAsia="Times New Roman" w:hAnsi="Segoe UI" w:cs="Segoe UI"/>
+                <w:b/>
+                <w:bCs/>
+                <w:kern w:val="0"/>
+                <w:sz w:val="23"/>
+                <w:szCs w:val="23"/>
+                <w:lang w:val="es-US" w:eastAsia="es-US"/>
+                <w14:ligatures w14:val="none"/>
+              </w:rPr>
+              <w:t>II. Ejecución del Trabajo de Campo</w:t>
+            </w:r>
+          </w:p>
+        </w:tc>
+        <w:tc>
+          <w:tcPr>
+            <w:tcW w:w="2267" w:type="dxa"/>
+            <w:tcMar>
+              <w:top w:w="150" w:type="dxa"/>
+              <w:left w:w="240" w:type="dxa"/>
+              <w:bottom w:w="150" w:type="dxa"/>
+              <w:right w:w="240" w:type="dxa"/>
+            </w:tcMar>
+            <w:vAlign w:val="center"/>
+            <w:hideMark/>
+          </w:tcPr>
+          <w:p>
+            <w:pPr>
+              <w:spacing w:after="0" w:line="375" w:lineRule="atLeast"/>
+              <w:rPr>
+                <w:rFonts w:ascii="Segoe UI" w:eastAsia="Times New Roman" w:hAnsi="Segoe UI" w:cs="Segoe UI"/>
+                <w:kern w:val="0"/>
+                <w:sz w:val="23"/>
+                <w:szCs w:val="23"/>
+                <w:lang w:val="es-US" w:eastAsia="es-US"/>
+                <w14:ligatures w14:val="none"/>
+              </w:rPr>
+            </w:pPr>
+            <w:r>
+              <w:rPr>
+                <w:rFonts w:ascii="Segoe UI" w:eastAsia="Times New Roman" w:hAnsi="Segoe UI" w:cs="Segoe UI"/>
+                <w:kern w:val="0"/>
+                <w:sz w:val="23"/>
+                <w:szCs w:val="23"/>
+                <w:lang w:val="es-US" w:eastAsia="es-US"/>
+                <w14:ligatures w14:val="none"/>
+              </w:rPr>
+              <w:t xml:space="preserve">Obtener evidencia objetiva del estado de la red </w:t>
+            </w:r>
+            <w:r>
+              <w:rPr>
+                <w:rFonts w:ascii="Segoe UI" w:eastAsia="Times New Roman" w:hAnsi="Segoe UI" w:cs="Segoe UI"/>
+                <w:kern w:val="0"/>
+                <w:sz w:val="23"/>
+                <w:szCs w:val="23"/>
+                <w:lang w:val="es-US" w:eastAsia="es-US"/>
+                <w14:ligatures w14:val="none"/>
+              </w:rPr>
+              <w:lastRenderedPageBreak/>
+              <w:t>(física y lógica) y del hardware de cómputo (23 equipos), así como de la gestión administrativa de TI.</w:t>
+            </w:r>
+          </w:p>
+        </w:tc>
+        <w:tc>
+          <w:tcPr>
+            <w:tcW w:w="3135" w:type="dxa"/>
+            <w:tcMar>
+              <w:top w:w="150" w:type="dxa"/>
+              <w:left w:w="240" w:type="dxa"/>
+              <w:bottom w:w="150" w:type="dxa"/>
+              <w:right w:w="240" w:type="dxa"/>
+            </w:tcMar>
+            <w:vAlign w:val="center"/>
+            <w:hideMark/>
+          </w:tcPr>
+          <w:p>
+            <w:pPr>
+              <w:spacing w:after="0" w:line="375" w:lineRule="atLeast"/>
+              <w:rPr>
+                <w:rFonts w:ascii="Segoe UI" w:eastAsia="Times New Roman" w:hAnsi="Segoe UI" w:cs="Segoe UI"/>
+                <w:kern w:val="0"/>
+                <w:sz w:val="23"/>
+                <w:szCs w:val="23"/>
+                <w:lang w:val="es-US" w:eastAsia="es-US"/>
+                <w14:ligatures w14:val="none"/>
+              </w:rPr>
+            </w:pPr>
+            <w:r>
+              <w:rPr>
+                <w:rFonts w:ascii="Segoe UI" w:eastAsia="Times New Roman" w:hAnsi="Segoe UI" w:cs="Segoe UI"/>
+                <w:kern w:val="0"/>
+                <w:sz w:val="23"/>
+                <w:szCs w:val="23"/>
+                <w:lang w:val="es-US" w:eastAsia="es-US"/>
+                <w14:ligatures w14:val="none"/>
+              </w:rPr>
+              <w:lastRenderedPageBreak/>
+              <w:t>- Inspección física del área de comunicaciones (</w:t>
+            </w:r>
+            <w:proofErr w:type="spellStart"/>
+            <w:r>
+              <w:rPr>
+                <w:rFonts w:ascii="Segoe UI" w:eastAsia="Times New Roman" w:hAnsi="Segoe UI" w:cs="Segoe UI"/>
+                <w:kern w:val="0"/>
+                <w:sz w:val="23"/>
+                <w:szCs w:val="23"/>
+                <w:lang w:val="es-US" w:eastAsia="es-US"/>
+                <w14:ligatures w14:val="none"/>
+              </w:rPr>
+              <w:t>router</w:t>
+            </w:r>
+            <w:proofErr w:type="spellEnd"/>
+            <w:r>
+              <w:rPr>
+                <w:rFonts w:ascii="Segoe UI" w:eastAsia="Times New Roman" w:hAnsi="Segoe UI" w:cs="Segoe UI"/>
+                <w:kern w:val="0"/>
+                <w:sz w:val="23"/>
+                <w:szCs w:val="23"/>
+                <w:lang w:val="es-US" w:eastAsia="es-US"/>
+                <w14:ligatures w14:val="none"/>
+              </w:rPr>
+              <w:t>, switch, UPS, escritorio de madera).</w:t>
+            </w:r>
+            <w:r>
+              <w:rPr>
+                <w:rFonts w:ascii="Segoe UI" w:eastAsia="Times New Roman" w:hAnsi="Segoe UI" w:cs="Segoe UI"/>
+                <w:kern w:val="0"/>
+                <w:sz w:val="23"/>
+                <w:szCs w:val="23"/>
+                <w:lang w:val="es-US" w:eastAsia="es-US"/>
+                <w14:ligatures w14:val="none"/>
+              </w:rPr>
+              <w:br/>
+            </w:r>
+            <w:r>
+              <w:rPr>
+                <w:rFonts w:ascii="Segoe UI" w:eastAsia="Times New Roman" w:hAnsi="Segoe UI" w:cs="Segoe UI"/>
+                <w:kern w:val="0"/>
+                <w:sz w:val="23"/>
+                <w:szCs w:val="23"/>
+                <w:lang w:val="es-US" w:eastAsia="es-US"/>
+                <w14:ligatures w14:val="none"/>
+              </w:rPr>
+              <w:lastRenderedPageBreak/>
+              <w:t>- Inspección de cableado horizontal (23 tendidos UTP Cat6, conectores RJ45, norma de ponchado T568B, canalización con grapas plásticas, etiquetado tipo banderín).</w:t>
+            </w:r>
+            <w:r>
+              <w:rPr>
+                <w:rFonts w:ascii="Segoe UI" w:eastAsia="Times New Roman" w:hAnsi="Segoe UI" w:cs="Segoe UI"/>
+                <w:kern w:val="0"/>
+                <w:sz w:val="23"/>
+                <w:szCs w:val="23"/>
+                <w:lang w:val="es-US" w:eastAsia="es-US"/>
+                <w14:ligatures w14:val="none"/>
+              </w:rPr>
+              <w:br/>
+              <w:t xml:space="preserve">- Pruebas de continuidad con cable </w:t>
+            </w:r>
+            <w:proofErr w:type="spellStart"/>
+            <w:r>
+              <w:rPr>
+                <w:rFonts w:ascii="Segoe UI" w:eastAsia="Times New Roman" w:hAnsi="Segoe UI" w:cs="Segoe UI"/>
+                <w:kern w:val="0"/>
+                <w:sz w:val="23"/>
+                <w:szCs w:val="23"/>
+                <w:lang w:val="es-US" w:eastAsia="es-US"/>
+                <w14:ligatures w14:val="none"/>
+              </w:rPr>
+              <w:t>tester</w:t>
+            </w:r>
+            <w:proofErr w:type="spellEnd"/>
+            <w:r>
+              <w:rPr>
+                <w:rFonts w:ascii="Segoe UI" w:eastAsia="Times New Roman" w:hAnsi="Segoe UI" w:cs="Segoe UI"/>
+                <w:kern w:val="0"/>
+                <w:sz w:val="23"/>
+                <w:szCs w:val="23"/>
+                <w:lang w:val="es-US" w:eastAsia="es-US"/>
+                <w14:ligatures w14:val="none"/>
+              </w:rPr>
+              <w:t xml:space="preserve"> a los 23 tendidos.</w:t>
+            </w:r>
+            <w:r>
+              <w:rPr>
+                <w:rFonts w:ascii="Segoe UI" w:eastAsia="Times New Roman" w:hAnsi="Segoe UI" w:cs="Segoe UI"/>
+                <w:kern w:val="0"/>
+                <w:sz w:val="23"/>
+                <w:szCs w:val="23"/>
+                <w:lang w:val="es-US" w:eastAsia="es-US"/>
+                <w14:ligatures w14:val="none"/>
+              </w:rPr>
+              <w:br/>
+              <w:t xml:space="preserve">- Inspección de áreas de trabajo (rosetas, </w:t>
+            </w:r>
+            <w:proofErr w:type="spellStart"/>
+            <w:r>
+              <w:rPr>
+                <w:rFonts w:ascii="Segoe UI" w:eastAsia="Times New Roman" w:hAnsi="Segoe UI" w:cs="Segoe UI"/>
+                <w:kern w:val="0"/>
+                <w:sz w:val="23"/>
+                <w:szCs w:val="23"/>
+                <w:lang w:val="es-US" w:eastAsia="es-US"/>
+                <w14:ligatures w14:val="none"/>
+              </w:rPr>
+              <w:t>patch</w:t>
+            </w:r>
+            <w:proofErr w:type="spellEnd"/>
+            <w:r>
+              <w:rPr>
+                <w:rFonts w:ascii="Segoe UI" w:eastAsia="Times New Roman" w:hAnsi="Segoe UI" w:cs="Segoe UI"/>
+                <w:kern w:val="0"/>
+                <w:sz w:val="23"/>
+                <w:szCs w:val="23"/>
+                <w:lang w:val="es-US" w:eastAsia="es-US"/>
+                <w14:ligatures w14:val="none"/>
+              </w:rPr>
+              <w:t xml:space="preserve"> </w:t>
+            </w:r>
+            <w:proofErr w:type="spellStart"/>
+            <w:r>
+              <w:rPr>
+                <w:rFonts w:ascii="Segoe UI" w:eastAsia="Times New Roman" w:hAnsi="Segoe UI" w:cs="Segoe UI"/>
+                <w:kern w:val="0"/>
+                <w:sz w:val="23"/>
+                <w:szCs w:val="23"/>
+                <w:lang w:val="es-US" w:eastAsia="es-US"/>
+                <w14:ligatures w14:val="none"/>
+              </w:rPr>
+              <w:t>cords</w:t>
+            </w:r>
+            <w:proofErr w:type="spellEnd"/>
+            <w:r>
+              <w:rPr>
+                <w:rFonts w:ascii="Segoe UI" w:eastAsia="Times New Roman" w:hAnsi="Segoe UI" w:cs="Segoe UI"/>
+                <w:kern w:val="0"/>
+                <w:sz w:val="23"/>
+                <w:szCs w:val="23"/>
+                <w:lang w:val="es-US" w:eastAsia="es-US"/>
+                <w14:ligatures w14:val="none"/>
+              </w:rPr>
+              <w:t>, 23 computadoras).</w:t>
+            </w:r>
+            <w:r>
+              <w:rPr>
+                <w:rFonts w:ascii="Segoe UI" w:eastAsia="Times New Roman" w:hAnsi="Segoe UI" w:cs="Segoe UI"/>
+                <w:kern w:val="0"/>
+                <w:sz w:val="23"/>
+                <w:szCs w:val="23"/>
+                <w:lang w:val="es-US" w:eastAsia="es-US"/>
+                <w14:ligatures w14:val="none"/>
+              </w:rPr>
+              <w:br/>
+              <w:t xml:space="preserve">- Verificación del estado de hardware de las 23 </w:t>
+            </w:r>
+            <w:proofErr w:type="spellStart"/>
+            <w:r>
+              <w:rPr>
+                <w:rFonts w:ascii="Segoe UI" w:eastAsia="Times New Roman" w:hAnsi="Segoe UI" w:cs="Segoe UI"/>
+                <w:kern w:val="0"/>
+                <w:sz w:val="23"/>
+                <w:szCs w:val="23"/>
+                <w:lang w:val="es-US" w:eastAsia="es-US"/>
+                <w14:ligatures w14:val="none"/>
+              </w:rPr>
+              <w:t>PCs</w:t>
+            </w:r>
+            <w:proofErr w:type="spellEnd"/>
+            <w:r>
+              <w:rPr>
+                <w:rFonts w:ascii="Segoe UI" w:eastAsia="Times New Roman" w:hAnsi="Segoe UI" w:cs="Segoe UI"/>
+                <w:kern w:val="0"/>
+                <w:sz w:val="23"/>
+                <w:szCs w:val="23"/>
+                <w:lang w:val="es-US" w:eastAsia="es-US"/>
+                <w14:ligatures w14:val="none"/>
+              </w:rPr>
+              <w:t xml:space="preserve"> (discos duros, memoria RAM, fuentes de poder, ventilación, limpieza interna, periféricos).</w:t>
+            </w:r>
+            <w:r>
+              <w:rPr>
+                <w:rFonts w:ascii="Segoe UI" w:eastAsia="Times New Roman" w:hAnsi="Segoe UI" w:cs="Segoe UI"/>
+                <w:kern w:val="0"/>
+                <w:sz w:val="23"/>
+                <w:szCs w:val="23"/>
+                <w:lang w:val="es-US" w:eastAsia="es-US"/>
+                <w14:ligatures w14:val="none"/>
+              </w:rPr>
+              <w:br/>
+              <w:t xml:space="preserve">- Pruebas lógicas de red (DHCP, DNS, firewall, </w:t>
+            </w:r>
+            <w:proofErr w:type="spellStart"/>
+            <w:r>
+              <w:rPr>
+                <w:rFonts w:ascii="Segoe UI" w:eastAsia="Times New Roman" w:hAnsi="Segoe UI" w:cs="Segoe UI"/>
+                <w:kern w:val="0"/>
+                <w:sz w:val="23"/>
+                <w:szCs w:val="23"/>
+                <w:lang w:val="es-US" w:eastAsia="es-US"/>
+                <w14:ligatures w14:val="none"/>
+              </w:rPr>
+              <w:t>QoS</w:t>
+            </w:r>
+            <w:proofErr w:type="spellEnd"/>
+            <w:r>
+              <w:rPr>
+                <w:rFonts w:ascii="Segoe UI" w:eastAsia="Times New Roman" w:hAnsi="Segoe UI" w:cs="Segoe UI"/>
+                <w:kern w:val="0"/>
+                <w:sz w:val="23"/>
+                <w:szCs w:val="23"/>
+                <w:lang w:val="es-US" w:eastAsia="es-US"/>
+                <w14:ligatures w14:val="none"/>
+              </w:rPr>
+              <w:t>, segmentación).</w:t>
+            </w:r>
+            <w:r>
+              <w:rPr>
+                <w:rFonts w:ascii="Segoe UI" w:eastAsia="Times New Roman" w:hAnsi="Segoe UI" w:cs="Segoe UI"/>
+                <w:kern w:val="0"/>
+                <w:sz w:val="23"/>
+                <w:szCs w:val="23"/>
+                <w:lang w:val="es-US" w:eastAsia="es-US"/>
+                <w14:ligatures w14:val="none"/>
+              </w:rPr>
+              <w:br/>
+              <w:t>- Entrevista semiestructurada al Director (cuestionario de 30 preguntas).</w:t>
+            </w:r>
+            <w:r>
+              <w:rPr>
+                <w:rFonts w:ascii="Segoe UI" w:eastAsia="Times New Roman" w:hAnsi="Segoe UI" w:cs="Segoe UI"/>
+                <w:kern w:val="0"/>
+                <w:sz w:val="23"/>
+                <w:szCs w:val="23"/>
+                <w:lang w:val="es-US" w:eastAsia="es-US"/>
+                <w14:ligatures w14:val="none"/>
+              </w:rPr>
+              <w:br/>
+              <w:t>- Revisión documental (políticas, inventarios, registros de incidentes).</w:t>
+            </w:r>
+            <w:r>
+              <w:rPr>
+                <w:rFonts w:ascii="Segoe UI" w:eastAsia="Times New Roman" w:hAnsi="Segoe UI" w:cs="Segoe UI"/>
+                <w:kern w:val="0"/>
+                <w:sz w:val="23"/>
+                <w:szCs w:val="23"/>
+                <w:lang w:val="es-US" w:eastAsia="es-US"/>
+                <w14:ligatures w14:val="none"/>
+              </w:rPr>
+              <w:br/>
+            </w:r>
+            <w:r>
+              <w:rPr>
+                <w:rFonts w:ascii="Segoe UI" w:eastAsia="Times New Roman" w:hAnsi="Segoe UI" w:cs="Segoe UI"/>
+                <w:kern w:val="0"/>
+                <w:sz w:val="23"/>
+                <w:szCs w:val="23"/>
+                <w:lang w:val="es-US" w:eastAsia="es-US"/>
+                <w14:ligatures w14:val="none"/>
+              </w:rPr>
+              <w:lastRenderedPageBreak/>
+              <w:t>- Registro fotográfico indexado de hallazgos.</w:t>
+            </w:r>
+          </w:p>
+        </w:tc>
+        <w:tc>
+          <w:tcPr>
+            <w:tcW w:w="2261" w:type="dxa"/>
+            <w:tcMar>
+              <w:top w:w="150" w:type="dxa"/>
+              <w:left w:w="240" w:type="dxa"/>
+              <w:bottom w:w="150" w:type="dxa"/>
+              <w:right w:w="240" w:type="dxa"/>
+            </w:tcMar>
+            <w:vAlign w:val="center"/>
+            <w:hideMark/>
+          </w:tcPr>
+          <w:p>
+            <w:pPr>
+              <w:spacing w:after="0" w:line="375" w:lineRule="atLeast"/>
+              <w:rPr>
+                <w:rFonts w:ascii="Segoe UI" w:eastAsia="Times New Roman" w:hAnsi="Segoe UI" w:cs="Segoe UI"/>
+                <w:kern w:val="0"/>
+                <w:sz w:val="23"/>
+                <w:szCs w:val="23"/>
+                <w:lang w:val="es-US" w:eastAsia="es-US"/>
+                <w14:ligatures w14:val="none"/>
+              </w:rPr>
+            </w:pPr>
+            <w:r>
+              <w:rPr>
+                <w:rFonts w:ascii="Segoe UI" w:eastAsia="Times New Roman" w:hAnsi="Segoe UI" w:cs="Segoe UI"/>
+                <w:b/>
+                <w:bCs/>
+                <w:kern w:val="0"/>
+                <w:sz w:val="23"/>
+                <w:szCs w:val="23"/>
+                <w:lang w:val="es-US" w:eastAsia="es-US"/>
+                <w14:ligatures w14:val="none"/>
+              </w:rPr>
+              <w:lastRenderedPageBreak/>
+              <w:t>Auditor Líder:</w:t>
+            </w:r>
+            <w:r>
+              <w:rPr>
+                <w:rFonts w:ascii="Segoe UI" w:eastAsia="Times New Roman" w:hAnsi="Segoe UI" w:cs="Segoe UI"/>
+                <w:kern w:val="0"/>
+                <w:sz w:val="23"/>
+                <w:szCs w:val="23"/>
+                <w:lang w:val="es-US" w:eastAsia="es-US"/>
+                <w14:ligatures w14:val="none"/>
+              </w:rPr>
+              <w:t> Br. Gerson Antonio Valdivia</w:t>
+            </w:r>
+            <w:r>
+              <w:rPr>
+                <w:rFonts w:ascii="Segoe UI" w:eastAsia="Times New Roman" w:hAnsi="Segoe UI" w:cs="Segoe UI"/>
+                <w:kern w:val="0"/>
+                <w:sz w:val="23"/>
+                <w:szCs w:val="23"/>
+                <w:lang w:val="es-US" w:eastAsia="es-US"/>
+                <w14:ligatures w14:val="none"/>
+              </w:rPr>
+              <w:br/>
+            </w:r>
+            <w:r>
+              <w:rPr>
+                <w:rFonts w:ascii="Segoe UI" w:eastAsia="Times New Roman" w:hAnsi="Segoe UI" w:cs="Segoe UI"/>
+                <w:b/>
+                <w:bCs/>
+                <w:kern w:val="0"/>
+                <w:sz w:val="23"/>
+                <w:szCs w:val="23"/>
+                <w:lang w:val="es-US" w:eastAsia="es-US"/>
+                <w14:ligatures w14:val="none"/>
+              </w:rPr>
+              <w:t xml:space="preserve">Auditor </w:t>
+            </w:r>
+            <w:r>
+              <w:rPr>
+                <w:rFonts w:ascii="Segoe UI" w:eastAsia="Times New Roman" w:hAnsi="Segoe UI" w:cs="Segoe UI"/>
+                <w:b/>
+                <w:bCs/>
+                <w:kern w:val="0"/>
+                <w:sz w:val="23"/>
+                <w:szCs w:val="23"/>
+                <w:lang w:val="es-US" w:eastAsia="es-US"/>
+                <w14:ligatures w14:val="none"/>
+              </w:rPr>
+              <w:lastRenderedPageBreak/>
+              <w:t>Físico:</w:t>
+            </w:r>
+            <w:r>
+              <w:rPr>
+                <w:rFonts w:ascii="Segoe UI" w:eastAsia="Times New Roman" w:hAnsi="Segoe UI" w:cs="Segoe UI"/>
+                <w:kern w:val="0"/>
+                <w:sz w:val="23"/>
+                <w:szCs w:val="23"/>
+                <w:lang w:val="es-US" w:eastAsia="es-US"/>
+                <w14:ligatures w14:val="none"/>
+              </w:rPr>
+              <w:t xml:space="preserve"> Br. </w:t>
+            </w:r>
+            <w:proofErr w:type="spellStart"/>
+            <w:r>
+              <w:rPr>
+                <w:rFonts w:ascii="Segoe UI" w:eastAsia="Times New Roman" w:hAnsi="Segoe UI" w:cs="Segoe UI"/>
+                <w:kern w:val="0"/>
+                <w:sz w:val="23"/>
+                <w:szCs w:val="23"/>
+                <w:lang w:val="es-US" w:eastAsia="es-US"/>
+                <w14:ligatures w14:val="none"/>
+              </w:rPr>
+              <w:t>Haxell</w:t>
+            </w:r>
+            <w:proofErr w:type="spellEnd"/>
+            <w:r>
+              <w:rPr>
+                <w:rFonts w:ascii="Segoe UI" w:eastAsia="Times New Roman" w:hAnsi="Segoe UI" w:cs="Segoe UI"/>
+                <w:kern w:val="0"/>
+                <w:sz w:val="23"/>
+                <w:szCs w:val="23"/>
+                <w:lang w:val="es-US" w:eastAsia="es-US"/>
+                <w14:ligatures w14:val="none"/>
+              </w:rPr>
+              <w:t xml:space="preserve"> Antonio Trejos </w:t>
+            </w:r>
+            <w:proofErr w:type="spellStart"/>
+            <w:r>
+              <w:rPr>
+                <w:rFonts w:ascii="Segoe UI" w:eastAsia="Times New Roman" w:hAnsi="Segoe UI" w:cs="Segoe UI"/>
+                <w:kern w:val="0"/>
+                <w:sz w:val="23"/>
+                <w:szCs w:val="23"/>
+                <w:lang w:val="es-US" w:eastAsia="es-US"/>
+                <w14:ligatures w14:val="none"/>
+              </w:rPr>
+              <w:t>Rodriguez</w:t>
+            </w:r>
+            <w:proofErr w:type="spellEnd"/>
+            <w:r>
+              <w:rPr>
+                <w:rFonts w:ascii="Segoe UI" w:eastAsia="Times New Roman" w:hAnsi="Segoe UI" w:cs="Segoe UI"/>
+                <w:kern w:val="0"/>
+                <w:sz w:val="23"/>
+                <w:szCs w:val="23"/>
+                <w:lang w:val="es-US" w:eastAsia="es-US"/>
+                <w14:ligatures w14:val="none"/>
+              </w:rPr>
+              <w:br/>
+            </w:r>
+            <w:r>
+              <w:rPr>
+                <w:rFonts w:ascii="Segoe UI" w:eastAsia="Times New Roman" w:hAnsi="Segoe UI" w:cs="Segoe UI"/>
+                <w:b/>
+                <w:bCs/>
+                <w:kern w:val="0"/>
+                <w:sz w:val="23"/>
+                <w:szCs w:val="23"/>
+                <w:lang w:val="es-US" w:eastAsia="es-US"/>
+                <w14:ligatures w14:val="none"/>
+              </w:rPr>
+              <w:t>Auditor Lógico:</w:t>
+            </w:r>
+            <w:r>
+              <w:rPr>
+                <w:rFonts w:ascii="Segoe UI" w:eastAsia="Times New Roman" w:hAnsi="Segoe UI" w:cs="Segoe UI"/>
+                <w:kern w:val="0"/>
+                <w:sz w:val="23"/>
+                <w:szCs w:val="23"/>
+                <w:lang w:val="es-US" w:eastAsia="es-US"/>
+                <w14:ligatures w14:val="none"/>
+              </w:rPr>
+              <w:t> Br. Stephanie Lucía Mora Chávez</w:t>
+            </w:r>
+            <w:r>
+              <w:rPr>
+                <w:rFonts w:ascii="Segoe UI" w:eastAsia="Times New Roman" w:hAnsi="Segoe UI" w:cs="Segoe UI"/>
+                <w:kern w:val="0"/>
+                <w:sz w:val="23"/>
+                <w:szCs w:val="23"/>
+                <w:lang w:val="es-US" w:eastAsia="es-US"/>
+                <w14:ligatures w14:val="none"/>
+              </w:rPr>
+              <w:br/>
+            </w:r>
+            <w:r>
+              <w:rPr>
+                <w:rFonts w:ascii="Segoe UI" w:eastAsia="Times New Roman" w:hAnsi="Segoe UI" w:cs="Segoe UI"/>
+                <w:b/>
+                <w:bCs/>
+                <w:kern w:val="0"/>
+                <w:sz w:val="23"/>
+                <w:szCs w:val="23"/>
+                <w:lang w:val="es-US" w:eastAsia="es-US"/>
+                <w14:ligatures w14:val="none"/>
+              </w:rPr>
+              <w:t>Auditor Administrativo:</w:t>
+            </w:r>
+            <w:r>
+              <w:rPr>
+                <w:rFonts w:ascii="Segoe UI" w:eastAsia="Times New Roman" w:hAnsi="Segoe UI" w:cs="Segoe UI"/>
+                <w:kern w:val="0"/>
+                <w:sz w:val="23"/>
+                <w:szCs w:val="23"/>
+                <w:lang w:val="es-US" w:eastAsia="es-US"/>
+                <w14:ligatures w14:val="none"/>
+              </w:rPr>
+              <w:t xml:space="preserve"> Br. Alison Michelle Navarro </w:t>
+            </w:r>
+            <w:proofErr w:type="spellStart"/>
+            <w:r>
+              <w:rPr>
+                <w:rFonts w:ascii="Segoe UI" w:eastAsia="Times New Roman" w:hAnsi="Segoe UI" w:cs="Segoe UI"/>
+                <w:kern w:val="0"/>
+                <w:sz w:val="23"/>
+                <w:szCs w:val="23"/>
+                <w:lang w:val="es-US" w:eastAsia="es-US"/>
+                <w14:ligatures w14:val="none"/>
+              </w:rPr>
+              <w:t>Goussen</w:t>
+            </w:r>
+            <w:proofErr w:type="spellEnd"/>
+            <w:r>
+              <w:rPr>
+                <w:rFonts w:ascii="Segoe UI" w:eastAsia="Times New Roman" w:hAnsi="Segoe UI" w:cs="Segoe UI"/>
+                <w:kern w:val="0"/>
+                <w:sz w:val="23"/>
+                <w:szCs w:val="23"/>
+                <w:lang w:val="es-US" w:eastAsia="es-US"/>
+                <w14:ligatures w14:val="none"/>
+              </w:rPr>
+              <w:br/>
+            </w:r>
+            <w:r>
+              <w:rPr>
+                <w:rFonts w:ascii="Segoe UI" w:eastAsia="Times New Roman" w:hAnsi="Segoe UI" w:cs="Segoe UI"/>
+                <w:b/>
+                <w:bCs/>
+                <w:kern w:val="0"/>
+                <w:sz w:val="23"/>
+                <w:szCs w:val="23"/>
+                <w:lang w:val="es-US" w:eastAsia="es-US"/>
+                <w14:ligatures w14:val="none"/>
+              </w:rPr>
+              <w:t>Documentalista:</w:t>
+            </w:r>
+            <w:r>
+              <w:rPr>
+                <w:rFonts w:ascii="Segoe UI" w:eastAsia="Times New Roman" w:hAnsi="Segoe UI" w:cs="Segoe UI"/>
+                <w:kern w:val="0"/>
+                <w:sz w:val="23"/>
+                <w:szCs w:val="23"/>
+                <w:lang w:val="es-US" w:eastAsia="es-US"/>
+                <w14:ligatures w14:val="none"/>
+              </w:rPr>
+              <w:t> Br. Arleth del Rosario Velásquez Gómez</w:t>
+            </w:r>
+          </w:p>
+        </w:tc>
+        <w:tc>
+          <w:tcPr>
+            <w:tcW w:w="2329" w:type="dxa"/>
+            <w:tcMar>
+              <w:top w:w="150" w:type="dxa"/>
+              <w:left w:w="240" w:type="dxa"/>
+              <w:bottom w:w="150" w:type="dxa"/>
+              <w:right w:w="0" w:type="dxa"/>
+            </w:tcMar>
+            <w:vAlign w:val="center"/>
+            <w:hideMark/>
+          </w:tcPr>
+          <w:p>
+            <w:pPr>
+              <w:spacing w:after="0" w:line="375" w:lineRule="atLeast"/>
+              <w:rPr>
+                <w:rFonts w:ascii="Segoe UI" w:eastAsia="Times New Roman" w:hAnsi="Segoe UI" w:cs="Segoe UI"/>
+                <w:kern w:val="0"/>
+                <w:sz w:val="23"/>
+                <w:szCs w:val="23"/>
+                <w:lang w:val="es-US" w:eastAsia="es-US"/>
+                <w14:ligatures w14:val="none"/>
+              </w:rPr>
+            </w:pPr>
+            <w:r>
+              <w:rPr>
+                <w:rFonts w:ascii="Segoe UI" w:eastAsia="Times New Roman" w:hAnsi="Segoe UI" w:cs="Segoe UI"/>
+                <w:kern w:val="0"/>
+                <w:sz w:val="23"/>
+                <w:szCs w:val="23"/>
+                <w:lang w:val="es-US" w:eastAsia="es-US"/>
+                <w14:ligatures w14:val="none"/>
+              </w:rPr>
+              <w:lastRenderedPageBreak/>
+              <w:t xml:space="preserve">Técnicos e ingenieros con competencias en auditoría de </w:t>
+            </w:r>
+            <w:r>
+              <w:rPr>
+                <w:rFonts w:ascii="Segoe UI" w:eastAsia="Times New Roman" w:hAnsi="Segoe UI" w:cs="Segoe UI"/>
+                <w:kern w:val="0"/>
+                <w:sz w:val="23"/>
+                <w:szCs w:val="23"/>
+                <w:lang w:val="es-US" w:eastAsia="es-US"/>
+                <w14:ligatures w14:val="none"/>
+              </w:rPr>
+              <w:lastRenderedPageBreak/>
+              <w:t xml:space="preserve">infraestructura de red (capa física y lógica), evaluación de hardware de cómputo, aplicación de estándares TIA/EIA, manejo de herramientas de prueba (cable </w:t>
+            </w:r>
+            <w:proofErr w:type="spellStart"/>
+            <w:r>
+              <w:rPr>
+                <w:rFonts w:ascii="Segoe UI" w:eastAsia="Times New Roman" w:hAnsi="Segoe UI" w:cs="Segoe UI"/>
+                <w:kern w:val="0"/>
+                <w:sz w:val="23"/>
+                <w:szCs w:val="23"/>
+                <w:lang w:val="es-US" w:eastAsia="es-US"/>
+                <w14:ligatures w14:val="none"/>
+              </w:rPr>
+              <w:t>tester</w:t>
+            </w:r>
+            <w:proofErr w:type="spellEnd"/>
+            <w:r>
+              <w:rPr>
+                <w:rFonts w:ascii="Segoe UI" w:eastAsia="Times New Roman" w:hAnsi="Segoe UI" w:cs="Segoe UI"/>
+                <w:kern w:val="0"/>
+                <w:sz w:val="23"/>
+                <w:szCs w:val="23"/>
+                <w:lang w:val="es-US" w:eastAsia="es-US"/>
+                <w14:ligatures w14:val="none"/>
+              </w:rPr>
+              <w:t>, comandos de red, software de diagnóstico de hardware), capacidad de observación, entrevista y registro de evidencias.</w:t>
+            </w:r>
+          </w:p>
+        </w:tc>
+      </w:tr>
+      <w:tr>
+        <w:tc>
+          <w:tcPr>
+            <w:tcW w:w="1618" w:type="dxa"/>
+            <w:tcMar>
+              <w:top w:w="150" w:type="dxa"/>
+              <w:left w:w="0" w:type="dxa"/>
+              <w:bottom w:w="150" w:type="dxa"/>
+              <w:right w:w="240" w:type="dxa"/>
+            </w:tcMar>
+            <w:vAlign w:val="center"/>
+            <w:hideMark/>
+          </w:tcPr>
+          <w:p>
+            <w:pPr>
+              <w:spacing w:after="0" w:line="375" w:lineRule="atLeast"/>
+              <w:rPr>
+                <w:rFonts w:ascii="Segoe UI" w:eastAsia="Times New Roman" w:hAnsi="Segoe UI" w:cs="Segoe UI"/>
+                <w:kern w:val="0"/>
+                <w:sz w:val="23"/>
+                <w:szCs w:val="23"/>
+                <w:lang w:val="es-US" w:eastAsia="es-US"/>
+                <w14:ligatures w14:val="none"/>
+              </w:rPr>
+            </w:pPr>
+            <w:r>
+              <w:rPr>
+                <w:rFonts w:ascii="Segoe UI" w:eastAsia="Times New Roman" w:hAnsi="Segoe UI" w:cs="Segoe UI"/>
+                <w:b/>
+                <w:bCs/>
+                <w:kern w:val="0"/>
+                <w:sz w:val="23"/>
+                <w:szCs w:val="23"/>
+                <w:lang w:val="es-US" w:eastAsia="es-US"/>
+                <w14:ligatures w14:val="none"/>
+              </w:rPr>
+              <w:lastRenderedPageBreak/>
+              <w:t>III. Análisis y Diagnóstico</w:t>
+            </w:r>
+          </w:p>
+        </w:tc>
+        <w:tc>
+          <w:tcPr>
+            <w:tcW w:w="2267" w:type="dxa"/>
+            <w:tcMar>
+              <w:top w:w="150" w:type="dxa"/>
+              <w:left w:w="240" w:type="dxa"/>
+              <w:bottom w:w="150" w:type="dxa"/>
+              <w:right w:w="240" w:type="dxa"/>
+            </w:tcMar>
+            <w:vAlign w:val="center"/>
+            <w:hideMark/>
+          </w:tcPr>
+          <w:p>
+            <w:pPr>
+              <w:spacing w:after="0" w:line="375" w:lineRule="atLeast"/>
+              <w:rPr>
+                <w:rFonts w:ascii="Segoe UI" w:eastAsia="Times New Roman" w:hAnsi="Segoe UI" w:cs="Segoe UI"/>
+                <w:kern w:val="0"/>
+                <w:sz w:val="23"/>
+                <w:szCs w:val="23"/>
+                <w:lang w:val="es-US" w:eastAsia="es-US"/>
+                <w14:ligatures w14:val="none"/>
+              </w:rPr>
+            </w:pPr>
+            <w:r>
+              <w:rPr>
+                <w:rFonts w:ascii="Segoe UI" w:eastAsia="Times New Roman" w:hAnsi="Segoe UI" w:cs="Segoe UI"/>
+                <w:kern w:val="0"/>
+                <w:sz w:val="23"/>
+                <w:szCs w:val="23"/>
+                <w:lang w:val="es-US" w:eastAsia="es-US"/>
+                <w14:ligatures w14:val="none"/>
+              </w:rPr>
+              <w:t>Clasificar y analizar los hallazgos obtenidos en el trabajo de campo para emitir un diagnóstico técnico confiable de la red y el hardware del Instituto.</w:t>
+            </w:r>
+          </w:p>
+        </w:tc>
+        <w:tc>
+          <w:tcPr>
+            <w:tcW w:w="3135" w:type="dxa"/>
+            <w:tcMar>
+              <w:top w:w="150" w:type="dxa"/>
+              <w:left w:w="240" w:type="dxa"/>
+              <w:bottom w:w="150" w:type="dxa"/>
+              <w:right w:w="240" w:type="dxa"/>
+            </w:tcMar>
+            <w:vAlign w:val="center"/>
+            <w:hideMark/>
+          </w:tcPr>
+          <w:p>
+            <w:pPr>
+              <w:spacing w:after="0" w:line="375" w:lineRule="atLeast"/>
+              <w:rPr>
+                <w:rFonts w:ascii="Segoe UI" w:eastAsia="Times New Roman" w:hAnsi="Segoe UI" w:cs="Segoe UI"/>
+                <w:kern w:val="0"/>
+                <w:sz w:val="23"/>
+                <w:szCs w:val="23"/>
+                <w:lang w:val="es-US" w:eastAsia="es-US"/>
+                <w14:ligatures w14:val="none"/>
+              </w:rPr>
+            </w:pPr>
+            <w:r>
+              <w:rPr>
+                <w:rFonts w:ascii="Segoe UI" w:eastAsia="Times New Roman" w:hAnsi="Segoe UI" w:cs="Segoe UI"/>
+                <w:kern w:val="0"/>
+                <w:sz w:val="23"/>
+                <w:szCs w:val="23"/>
+                <w:lang w:val="es-US" w:eastAsia="es-US"/>
+                <w14:ligatures w14:val="none"/>
+              </w:rPr>
+              <w:t xml:space="preserve">- Consolidación de </w:t>
+            </w:r>
+            <w:proofErr w:type="spellStart"/>
+            <w:r>
+              <w:rPr>
+                <w:rFonts w:ascii="Segoe UI" w:eastAsia="Times New Roman" w:hAnsi="Segoe UI" w:cs="Segoe UI"/>
+                <w:kern w:val="0"/>
+                <w:sz w:val="23"/>
+                <w:szCs w:val="23"/>
+                <w:lang w:val="es-US" w:eastAsia="es-US"/>
+                <w14:ligatures w14:val="none"/>
+              </w:rPr>
+              <w:t>checklists</w:t>
+            </w:r>
+            <w:proofErr w:type="spellEnd"/>
+            <w:r>
+              <w:rPr>
+                <w:rFonts w:ascii="Segoe UI" w:eastAsia="Times New Roman" w:hAnsi="Segoe UI" w:cs="Segoe UI"/>
+                <w:kern w:val="0"/>
+                <w:sz w:val="23"/>
+                <w:szCs w:val="23"/>
+                <w:lang w:val="es-US" w:eastAsia="es-US"/>
+                <w14:ligatures w14:val="none"/>
+              </w:rPr>
+              <w:t xml:space="preserve"> y cálculo de porcentajes de cumplimiento por módulo.</w:t>
+            </w:r>
+            <w:r>
+              <w:rPr>
+                <w:rFonts w:ascii="Segoe UI" w:eastAsia="Times New Roman" w:hAnsi="Segoe UI" w:cs="Segoe UI"/>
+                <w:kern w:val="0"/>
+                <w:sz w:val="23"/>
+                <w:szCs w:val="23"/>
+                <w:lang w:val="es-US" w:eastAsia="es-US"/>
+                <w14:ligatures w14:val="none"/>
+              </w:rPr>
+              <w:br/>
+              <w:t>- Clasificación de hallazgos por tipo (NC = No Conformidad / OBS = Observación / OPM = Oportunidad de Mejora).</w:t>
+            </w:r>
+            <w:r>
+              <w:rPr>
+                <w:rFonts w:ascii="Segoe UI" w:eastAsia="Times New Roman" w:hAnsi="Segoe UI" w:cs="Segoe UI"/>
+                <w:kern w:val="0"/>
+                <w:sz w:val="23"/>
+                <w:szCs w:val="23"/>
+                <w:lang w:val="es-US" w:eastAsia="es-US"/>
+                <w14:ligatures w14:val="none"/>
+              </w:rPr>
+              <w:br/>
+              <w:t>- Análisis de brechas normativas (contraste con ISO 27001, TIA/EIA, COBIT 2019, leyes nicaragüenses).</w:t>
+            </w:r>
+            <w:r>
+              <w:rPr>
+                <w:rFonts w:ascii="Segoe UI" w:eastAsia="Times New Roman" w:hAnsi="Segoe UI" w:cs="Segoe UI"/>
+                <w:kern w:val="0"/>
+                <w:sz w:val="23"/>
+                <w:szCs w:val="23"/>
+                <w:lang w:val="es-US" w:eastAsia="es-US"/>
+                <w14:ligatures w14:val="none"/>
+              </w:rPr>
+              <w:br/>
+              <w:t>- Identificación de vulnerabilidades y amenazas (red y hardware).</w:t>
+            </w:r>
+            <w:r>
+              <w:rPr>
+                <w:rFonts w:ascii="Segoe UI" w:eastAsia="Times New Roman" w:hAnsi="Segoe UI" w:cs="Segoe UI"/>
+                <w:kern w:val="0"/>
+                <w:sz w:val="23"/>
+                <w:szCs w:val="23"/>
+                <w:lang w:val="es-US" w:eastAsia="es-US"/>
+                <w14:ligatures w14:val="none"/>
+              </w:rPr>
+              <w:br/>
+              <w:t>- Aplicación de matriz de riesgos ISO 27005 (cálculo de Impacto × Probabilidad para 20 riesgos identificados).</w:t>
+            </w:r>
+            <w:r>
+              <w:rPr>
+                <w:rFonts w:ascii="Segoe UI" w:eastAsia="Times New Roman" w:hAnsi="Segoe UI" w:cs="Segoe UI"/>
+                <w:kern w:val="0"/>
+                <w:sz w:val="23"/>
+                <w:szCs w:val="23"/>
+                <w:lang w:val="es-US" w:eastAsia="es-US"/>
+                <w14:ligatures w14:val="none"/>
+              </w:rPr>
+              <w:br/>
+              <w:t>- Determinación de causas raíz (técnica de los 5 Porqués) para riesgos críticos y altos.</w:t>
+            </w:r>
+            <w:r>
+              <w:rPr>
+                <w:rFonts w:ascii="Segoe UI" w:eastAsia="Times New Roman" w:hAnsi="Segoe UI" w:cs="Segoe UI"/>
+                <w:kern w:val="0"/>
+                <w:sz w:val="23"/>
+                <w:szCs w:val="23"/>
+                <w:lang w:val="es-US" w:eastAsia="es-US"/>
+                <w14:ligatures w14:val="none"/>
+              </w:rPr>
+              <w:br/>
+            </w:r>
+            <w:r>
+              <w:rPr>
+                <w:rFonts w:ascii="Segoe UI" w:eastAsia="Times New Roman" w:hAnsi="Segoe UI" w:cs="Segoe UI"/>
+                <w:kern w:val="0"/>
+                <w:sz w:val="23"/>
+                <w:szCs w:val="23"/>
+                <w:lang w:val="es-US" w:eastAsia="es-US"/>
+                <w14:ligatures w14:val="none"/>
+              </w:rPr>
+              <w:lastRenderedPageBreak/>
+              <w:t>- Evaluación del cumplimiento normativo por área auditada.</w:t>
+            </w:r>
+            <w:r>
+              <w:rPr>
+                <w:rFonts w:ascii="Segoe UI" w:eastAsia="Times New Roman" w:hAnsi="Segoe UI" w:cs="Segoe UI"/>
+                <w:kern w:val="0"/>
+                <w:sz w:val="23"/>
+                <w:szCs w:val="23"/>
+                <w:lang w:val="es-US" w:eastAsia="es-US"/>
+                <w14:ligatures w14:val="none"/>
+              </w:rPr>
+              <w:br/>
+              <w:t>- Elaboración de mapa de calor de riesgos (</w:t>
+            </w:r>
+            <w:proofErr w:type="spellStart"/>
+            <w:r>
+              <w:rPr>
+                <w:rFonts w:ascii="Segoe UI" w:eastAsia="Times New Roman" w:hAnsi="Segoe UI" w:cs="Segoe UI"/>
+                <w:kern w:val="0"/>
+                <w:sz w:val="23"/>
+                <w:szCs w:val="23"/>
+                <w:lang w:val="es-US" w:eastAsia="es-US"/>
+                <w14:ligatures w14:val="none"/>
+              </w:rPr>
+              <w:t>Heat</w:t>
+            </w:r>
+            <w:proofErr w:type="spellEnd"/>
+            <w:r>
+              <w:rPr>
+                <w:rFonts w:ascii="Segoe UI" w:eastAsia="Times New Roman" w:hAnsi="Segoe UI" w:cs="Segoe UI"/>
+                <w:kern w:val="0"/>
+                <w:sz w:val="23"/>
+                <w:szCs w:val="23"/>
+                <w:lang w:val="es-US" w:eastAsia="es-US"/>
+                <w14:ligatures w14:val="none"/>
+              </w:rPr>
+              <w:t xml:space="preserve"> </w:t>
+            </w:r>
+            <w:proofErr w:type="spellStart"/>
+            <w:r>
+              <w:rPr>
+                <w:rFonts w:ascii="Segoe UI" w:eastAsia="Times New Roman" w:hAnsi="Segoe UI" w:cs="Segoe UI"/>
+                <w:kern w:val="0"/>
+                <w:sz w:val="23"/>
+                <w:szCs w:val="23"/>
+                <w:lang w:val="es-US" w:eastAsia="es-US"/>
+                <w14:ligatures w14:val="none"/>
+              </w:rPr>
+              <w:t>Map</w:t>
+            </w:r>
+            <w:proofErr w:type="spellEnd"/>
+            <w:r>
+              <w:rPr>
+                <w:rFonts w:ascii="Segoe UI" w:eastAsia="Times New Roman" w:hAnsi="Segoe UI" w:cs="Segoe UI"/>
+                <w:kern w:val="0"/>
+                <w:sz w:val="23"/>
+                <w:szCs w:val="23"/>
+                <w:lang w:val="es-US" w:eastAsia="es-US"/>
+                <w14:ligatures w14:val="none"/>
+              </w:rPr>
+              <w:t>).</w:t>
+            </w:r>
+          </w:p>
+        </w:tc>
+        <w:tc>
+          <w:tcPr>
+            <w:tcW w:w="2261" w:type="dxa"/>
+            <w:tcMar>
+              <w:top w:w="150" w:type="dxa"/>
+              <w:left w:w="240" w:type="dxa"/>
+              <w:bottom w:w="150" w:type="dxa"/>
+              <w:right w:w="240" w:type="dxa"/>
+            </w:tcMar>
+            <w:vAlign w:val="center"/>
+            <w:hideMark/>
+          </w:tcPr>
+          <w:p>
+            <w:pPr>
+              <w:spacing w:after="0" w:line="375" w:lineRule="atLeast"/>
+              <w:rPr>
+                <w:rFonts w:ascii="Segoe UI" w:eastAsia="Times New Roman" w:hAnsi="Segoe UI" w:cs="Segoe UI"/>
+                <w:kern w:val="0"/>
+                <w:sz w:val="23"/>
+                <w:szCs w:val="23"/>
+                <w:lang w:val="es-US" w:eastAsia="es-US"/>
+                <w14:ligatures w14:val="none"/>
+              </w:rPr>
+            </w:pPr>
+            <w:r>
+              <w:rPr>
+                <w:rFonts w:ascii="Segoe UI" w:eastAsia="Times New Roman" w:hAnsi="Segoe UI" w:cs="Segoe UI"/>
+                <w:b/>
+                <w:bCs/>
+                <w:kern w:val="0"/>
+                <w:sz w:val="23"/>
+                <w:szCs w:val="23"/>
+                <w:lang w:val="es-US" w:eastAsia="es-US"/>
+                <w14:ligatures w14:val="none"/>
+              </w:rPr>
+              <w:lastRenderedPageBreak/>
+              <w:t>Auditor Líder:</w:t>
+            </w:r>
+            <w:r>
+              <w:rPr>
+                <w:rFonts w:ascii="Segoe UI" w:eastAsia="Times New Roman" w:hAnsi="Segoe UI" w:cs="Segoe UI"/>
+                <w:kern w:val="0"/>
+                <w:sz w:val="23"/>
+                <w:szCs w:val="23"/>
+                <w:lang w:val="es-US" w:eastAsia="es-US"/>
+                <w14:ligatures w14:val="none"/>
+              </w:rPr>
+              <w:t> Br. Gerson Antonio Valdivia</w:t>
+            </w:r>
+            <w:r>
+              <w:rPr>
+                <w:rFonts w:ascii="Segoe UI" w:eastAsia="Times New Roman" w:hAnsi="Segoe UI" w:cs="Segoe UI"/>
+                <w:kern w:val="0"/>
+                <w:sz w:val="23"/>
+                <w:szCs w:val="23"/>
+                <w:lang w:val="es-US" w:eastAsia="es-US"/>
+                <w14:ligatures w14:val="none"/>
+              </w:rPr>
+              <w:br/>
+            </w:r>
+            <w:r>
+              <w:rPr>
+                <w:rFonts w:ascii="Segoe UI" w:eastAsia="Times New Roman" w:hAnsi="Segoe UI" w:cs="Segoe UI"/>
+                <w:b/>
+                <w:bCs/>
+                <w:kern w:val="0"/>
+                <w:sz w:val="23"/>
+                <w:szCs w:val="23"/>
+                <w:lang w:val="es-US" w:eastAsia="es-US"/>
+                <w14:ligatures w14:val="none"/>
+              </w:rPr>
+              <w:t>Auditor Lógico:</w:t>
+            </w:r>
+            <w:r>
+              <w:rPr>
+                <w:rFonts w:ascii="Segoe UI" w:eastAsia="Times New Roman" w:hAnsi="Segoe UI" w:cs="Segoe UI"/>
+                <w:kern w:val="0"/>
+                <w:sz w:val="23"/>
+                <w:szCs w:val="23"/>
+                <w:lang w:val="es-US" w:eastAsia="es-US"/>
+                <w14:ligatures w14:val="none"/>
+              </w:rPr>
+              <w:t> Br. Stephanie Lucía Mora Chávez</w:t>
+            </w:r>
+            <w:r>
+              <w:rPr>
+                <w:rFonts w:ascii="Segoe UI" w:eastAsia="Times New Roman" w:hAnsi="Segoe UI" w:cs="Segoe UI"/>
+                <w:kern w:val="0"/>
+                <w:sz w:val="23"/>
+                <w:szCs w:val="23"/>
+                <w:lang w:val="es-US" w:eastAsia="es-US"/>
+                <w14:ligatures w14:val="none"/>
+              </w:rPr>
+              <w:br/>
+            </w:r>
+            <w:r>
+              <w:rPr>
+                <w:rFonts w:ascii="Segoe UI" w:eastAsia="Times New Roman" w:hAnsi="Segoe UI" w:cs="Segoe UI"/>
+                <w:b/>
+                <w:bCs/>
+                <w:kern w:val="0"/>
+                <w:sz w:val="23"/>
+                <w:szCs w:val="23"/>
+                <w:lang w:val="es-US" w:eastAsia="es-US"/>
+                <w14:ligatures w14:val="none"/>
+              </w:rPr>
+              <w:t>Auditor Físico:</w:t>
+            </w:r>
+            <w:r>
+              <w:rPr>
+                <w:rFonts w:ascii="Segoe UI" w:eastAsia="Times New Roman" w:hAnsi="Segoe UI" w:cs="Segoe UI"/>
+                <w:kern w:val="0"/>
+                <w:sz w:val="23"/>
+                <w:szCs w:val="23"/>
+                <w:lang w:val="es-US" w:eastAsia="es-US"/>
+                <w14:ligatures w14:val="none"/>
+              </w:rPr>
+              <w:t xml:space="preserve"> Br. </w:t>
+            </w:r>
+            <w:proofErr w:type="spellStart"/>
+            <w:r>
+              <w:rPr>
+                <w:rFonts w:ascii="Segoe UI" w:eastAsia="Times New Roman" w:hAnsi="Segoe UI" w:cs="Segoe UI"/>
+                <w:kern w:val="0"/>
+                <w:sz w:val="23"/>
+                <w:szCs w:val="23"/>
+                <w:lang w:val="es-US" w:eastAsia="es-US"/>
+                <w14:ligatures w14:val="none"/>
+              </w:rPr>
+              <w:t>Haxell</w:t>
+            </w:r>
+            <w:proofErr w:type="spellEnd"/>
+            <w:r>
+              <w:rPr>
+                <w:rFonts w:ascii="Segoe UI" w:eastAsia="Times New Roman" w:hAnsi="Segoe UI" w:cs="Segoe UI"/>
+                <w:kern w:val="0"/>
+                <w:sz w:val="23"/>
+                <w:szCs w:val="23"/>
+                <w:lang w:val="es-US" w:eastAsia="es-US"/>
+                <w14:ligatures w14:val="none"/>
+              </w:rPr>
+              <w:t xml:space="preserve"> Antonio Trejos </w:t>
+            </w:r>
+            <w:proofErr w:type="spellStart"/>
+            <w:r>
+              <w:rPr>
+                <w:rFonts w:ascii="Segoe UI" w:eastAsia="Times New Roman" w:hAnsi="Segoe UI" w:cs="Segoe UI"/>
+                <w:kern w:val="0"/>
+                <w:sz w:val="23"/>
+                <w:szCs w:val="23"/>
+                <w:lang w:val="es-US" w:eastAsia="es-US"/>
+                <w14:ligatures w14:val="none"/>
+              </w:rPr>
+              <w:t>Rodriguez</w:t>
+            </w:r>
+            <w:proofErr w:type="spellEnd"/>
+            <w:r>
+              <w:rPr>
+                <w:rFonts w:ascii="Segoe UI" w:eastAsia="Times New Roman" w:hAnsi="Segoe UI" w:cs="Segoe UI"/>
+                <w:kern w:val="0"/>
+                <w:sz w:val="23"/>
+                <w:szCs w:val="23"/>
+                <w:lang w:val="es-US" w:eastAsia="es-US"/>
+                <w14:ligatures w14:val="none"/>
+              </w:rPr>
+              <w:br/>
+            </w:r>
+            <w:r>
+              <w:rPr>
+                <w:rFonts w:ascii="Segoe UI" w:eastAsia="Times New Roman" w:hAnsi="Segoe UI" w:cs="Segoe UI"/>
+                <w:b/>
+                <w:bCs/>
+                <w:kern w:val="0"/>
+                <w:sz w:val="23"/>
+                <w:szCs w:val="23"/>
+                <w:lang w:val="es-US" w:eastAsia="es-US"/>
+                <w14:ligatures w14:val="none"/>
+              </w:rPr>
+              <w:t>Auditor Administrativo:</w:t>
+            </w:r>
+            <w:r>
+              <w:rPr>
+                <w:rFonts w:ascii="Segoe UI" w:eastAsia="Times New Roman" w:hAnsi="Segoe UI" w:cs="Segoe UI"/>
+                <w:kern w:val="0"/>
+                <w:sz w:val="23"/>
+                <w:szCs w:val="23"/>
+                <w:lang w:val="es-US" w:eastAsia="es-US"/>
+                <w14:ligatures w14:val="none"/>
+              </w:rPr>
+              <w:t xml:space="preserve"> Br. Alison Michelle Navarro </w:t>
+            </w:r>
+            <w:proofErr w:type="spellStart"/>
+            <w:r>
+              <w:rPr>
+                <w:rFonts w:ascii="Segoe UI" w:eastAsia="Times New Roman" w:hAnsi="Segoe UI" w:cs="Segoe UI"/>
+                <w:kern w:val="0"/>
+                <w:sz w:val="23"/>
+                <w:szCs w:val="23"/>
+                <w:lang w:val="es-US" w:eastAsia="es-US"/>
+                <w14:ligatures w14:val="none"/>
+              </w:rPr>
+              <w:t>Goussen</w:t>
+            </w:r>
+            <w:proofErr w:type="spellEnd"/>
+            <w:r>
+              <w:rPr>
+                <w:rFonts w:ascii="Segoe UI" w:eastAsia="Times New Roman" w:hAnsi="Segoe UI" w:cs="Segoe UI"/>
+                <w:kern w:val="0"/>
+                <w:sz w:val="23"/>
+                <w:szCs w:val="23"/>
+                <w:lang w:val="es-US" w:eastAsia="es-US"/>
+                <w14:ligatures w14:val="none"/>
+              </w:rPr>
+              <w:br/>
+            </w:r>
+            <w:r>
+              <w:rPr>
+                <w:rFonts w:ascii="Segoe UI" w:eastAsia="Times New Roman" w:hAnsi="Segoe UI" w:cs="Segoe UI"/>
+                <w:b/>
+                <w:bCs/>
+                <w:kern w:val="0"/>
+                <w:sz w:val="23"/>
+                <w:szCs w:val="23"/>
+                <w:lang w:val="es-US" w:eastAsia="es-US"/>
+                <w14:ligatures w14:val="none"/>
+              </w:rPr>
+              <w:t>Documentalista:</w:t>
+            </w:r>
+            <w:r>
+              <w:rPr>
+                <w:rFonts w:ascii="Segoe UI" w:eastAsia="Times New Roman" w:hAnsi="Segoe UI" w:cs="Segoe UI"/>
+                <w:kern w:val="0"/>
+                <w:sz w:val="23"/>
+                <w:szCs w:val="23"/>
+                <w:lang w:val="es-US" w:eastAsia="es-US"/>
+                <w14:ligatures w14:val="none"/>
+              </w:rPr>
+              <w:t> Br. Arleth del Rosario Velásquez Gómez</w:t>
+            </w:r>
+          </w:p>
+        </w:tc>
+        <w:tc>
+          <w:tcPr>
+            <w:tcW w:w="2329" w:type="dxa"/>
+            <w:tcMar>
+              <w:top w:w="150" w:type="dxa"/>
+              <w:left w:w="240" w:type="dxa"/>
+              <w:bottom w:w="150" w:type="dxa"/>
+              <w:right w:w="0" w:type="dxa"/>
+            </w:tcMar>
+            <w:vAlign w:val="center"/>
+            <w:hideMark/>
+          </w:tcPr>
+          <w:p>
+            <w:pPr>
+              <w:spacing w:after="0" w:line="375" w:lineRule="atLeast"/>
+              <w:rPr>
+                <w:rFonts w:ascii="Segoe UI" w:eastAsia="Times New Roman" w:hAnsi="Segoe UI" w:cs="Segoe UI"/>
+                <w:kern w:val="0"/>
+                <w:sz w:val="23"/>
+                <w:szCs w:val="23"/>
+                <w:lang w:val="es-US" w:eastAsia="es-US"/>
+                <w14:ligatures w14:val="none"/>
+              </w:rPr>
+            </w:pPr>
+            <w:r>
+              <w:rPr>
+                <w:rFonts w:ascii="Segoe UI" w:eastAsia="Times New Roman" w:hAnsi="Segoe UI" w:cs="Segoe UI"/>
+                <w:kern w:val="0"/>
+                <w:sz w:val="23"/>
+                <w:szCs w:val="23"/>
+                <w:lang w:val="es-US" w:eastAsia="es-US"/>
+                <w14:ligatures w14:val="none"/>
+              </w:rPr>
+              <w:t>Profesionales con conocimientos en gestión de riesgos (ISO 27005), análisis normativo (ISO 27001, TIA/EIA, COBIT 2019), técnicas de diagnóstico de infraestructura tecnológica, evaluación de hardware, y elaboración de hallazgos conforme a estándares internacionales y legislación nicaragüense (Ley 787, Ley 921).</w:t>
+            </w:r>
+          </w:p>
+        </w:tc>
+      </w:tr>
+      <w:tr>
+        <w:tc>
+          <w:tcPr>
+            <w:tcW w:w="1618" w:type="dxa"/>
+            <w:tcMar>
+              <w:top w:w="150" w:type="dxa"/>
+              <w:left w:w="0" w:type="dxa"/>
+              <w:bottom w:w="150" w:type="dxa"/>
+              <w:right w:w="240" w:type="dxa"/>
+            </w:tcMar>
+            <w:vAlign w:val="center"/>
+            <w:hideMark/>
+          </w:tcPr>
+          <w:p>
+            <w:pPr>
+              <w:spacing w:after="0" w:line="375" w:lineRule="atLeast"/>
+              <w:rPr>
+                <w:rFonts w:ascii="Segoe UI" w:eastAsia="Times New Roman" w:hAnsi="Segoe UI" w:cs="Segoe UI"/>
+                <w:kern w:val="0"/>
+                <w:sz w:val="23"/>
+                <w:szCs w:val="23"/>
+                <w:lang w:val="es-US" w:eastAsia="es-US"/>
+                <w14:ligatures w14:val="none"/>
+              </w:rPr>
+            </w:pPr>
+            <w:r>
+              <w:rPr>
+                <w:rFonts w:ascii="Segoe UI" w:eastAsia="Times New Roman" w:hAnsi="Segoe UI" w:cs="Segoe UI"/>
+                <w:b/>
+                <w:bCs/>
+                <w:kern w:val="0"/>
+                <w:sz w:val="23"/>
+                <w:szCs w:val="23"/>
+                <w:lang w:val="es-US" w:eastAsia="es-US"/>
+                <w14:ligatures w14:val="none"/>
+              </w:rPr>
+              <w:t>IV. Elaboración del Informe Final</w:t>
+            </w:r>
+          </w:p>
+        </w:tc>
+        <w:tc>
+          <w:tcPr>
+            <w:tcW w:w="2267" w:type="dxa"/>
+            <w:tcMar>
+              <w:top w:w="150" w:type="dxa"/>
+              <w:left w:w="240" w:type="dxa"/>
+              <w:bottom w:w="150" w:type="dxa"/>
+              <w:right w:w="240" w:type="dxa"/>
+            </w:tcMar>
+            <w:vAlign w:val="center"/>
+            <w:hideMark/>
+          </w:tcPr>
+          <w:p>
+            <w:pPr>
+              <w:spacing w:after="0" w:line="375" w:lineRule="atLeast"/>
+              <w:rPr>
+                <w:rFonts w:ascii="Segoe UI" w:eastAsia="Times New Roman" w:hAnsi="Segoe UI" w:cs="Segoe UI"/>
+                <w:kern w:val="0"/>
+                <w:sz w:val="23"/>
+                <w:szCs w:val="23"/>
+                <w:lang w:val="es-US" w:eastAsia="es-US"/>
+                <w14:ligatures w14:val="none"/>
+              </w:rPr>
+            </w:pPr>
+            <w:r>
+              <w:rPr>
+                <w:rFonts w:ascii="Segoe UI" w:eastAsia="Times New Roman" w:hAnsi="Segoe UI" w:cs="Segoe UI"/>
+                <w:kern w:val="0"/>
+                <w:sz w:val="23"/>
+                <w:szCs w:val="23"/>
+                <w:lang w:val="es-US" w:eastAsia="es-US"/>
+                <w14:ligatures w14:val="none"/>
+              </w:rPr>
+              <w:t>Sistematizar los hallazgos y emitir un informe técnico profesional con conclusiones, recomendaciones y un plan de mejora priorizado para la red y el hardware del Instituto.</w:t>
+            </w:r>
+          </w:p>
+        </w:tc>
+        <w:tc>
+          <w:tcPr>
+            <w:tcW w:w="3135" w:type="dxa"/>
+            <w:tcMar>
+              <w:top w:w="150" w:type="dxa"/>
+              <w:left w:w="240" w:type="dxa"/>
+              <w:bottom w:w="150" w:type="dxa"/>
+              <w:right w:w="240" w:type="dxa"/>
+            </w:tcMar>
+            <w:vAlign w:val="center"/>
+            <w:hideMark/>
+          </w:tcPr>
+          <w:p>
+            <w:pPr>
+              <w:spacing w:after="0" w:line="375" w:lineRule="atLeast"/>
+              <w:rPr>
+                <w:rFonts w:ascii="Segoe UI" w:eastAsia="Times New Roman" w:hAnsi="Segoe UI" w:cs="Segoe UI"/>
+                <w:kern w:val="0"/>
+                <w:sz w:val="23"/>
+                <w:szCs w:val="23"/>
+                <w:lang w:val="es-US" w:eastAsia="es-US"/>
+                <w14:ligatures w14:val="none"/>
+              </w:rPr>
+            </w:pPr>
+            <w:r>
+              <w:rPr>
+                <w:rFonts w:ascii="Segoe UI" w:eastAsia="Times New Roman" w:hAnsi="Segoe UI" w:cs="Segoe UI"/>
+                <w:kern w:val="0"/>
+                <w:sz w:val="23"/>
+                <w:szCs w:val="23"/>
+                <w:lang w:val="es-US" w:eastAsia="es-US"/>
+                <w14:ligatures w14:val="none"/>
+              </w:rPr>
+              <w:t>- Redacción técnica del informe por áreas auditadas (red física, red lógica, hardware, gestión administrativa).</w:t>
+            </w:r>
+            <w:r>
+              <w:rPr>
+                <w:rFonts w:ascii="Segoe UI" w:eastAsia="Times New Roman" w:hAnsi="Segoe UI" w:cs="Segoe UI"/>
+                <w:kern w:val="0"/>
+                <w:sz w:val="23"/>
+                <w:szCs w:val="23"/>
+                <w:lang w:val="es-US" w:eastAsia="es-US"/>
+                <w14:ligatures w14:val="none"/>
+              </w:rPr>
+              <w:br/>
+              <w:t xml:space="preserve">- Inclusión de evidencia documental y visual (fotografías indexadas, capturas de pantalla, </w:t>
+            </w:r>
+            <w:proofErr w:type="spellStart"/>
+            <w:r>
+              <w:rPr>
+                <w:rFonts w:ascii="Segoe UI" w:eastAsia="Times New Roman" w:hAnsi="Segoe UI" w:cs="Segoe UI"/>
+                <w:kern w:val="0"/>
+                <w:sz w:val="23"/>
+                <w:szCs w:val="23"/>
+                <w:lang w:val="es-US" w:eastAsia="es-US"/>
+                <w14:ligatures w14:val="none"/>
+              </w:rPr>
+              <w:t>checklists</w:t>
+            </w:r>
+            <w:proofErr w:type="spellEnd"/>
+            <w:r>
+              <w:rPr>
+                <w:rFonts w:ascii="Segoe UI" w:eastAsia="Times New Roman" w:hAnsi="Segoe UI" w:cs="Segoe UI"/>
+                <w:kern w:val="0"/>
+                <w:sz w:val="23"/>
+                <w:szCs w:val="23"/>
+                <w:lang w:val="es-US" w:eastAsia="es-US"/>
+                <w14:ligatures w14:val="none"/>
+              </w:rPr>
+              <w:t>).</w:t>
+            </w:r>
+            <w:r>
+              <w:rPr>
+                <w:rFonts w:ascii="Segoe UI" w:eastAsia="Times New Roman" w:hAnsi="Segoe UI" w:cs="Segoe UI"/>
+                <w:kern w:val="0"/>
+                <w:sz w:val="23"/>
+                <w:szCs w:val="23"/>
+                <w:lang w:val="es-US" w:eastAsia="es-US"/>
+                <w14:ligatures w14:val="none"/>
+              </w:rPr>
+              <w:br/>
+              <w:t>- Elaboración de matriz de hallazgos completa (con descripción, norma incumplida, evidencia, nivel de riesgo, recomendación, responsable y plazo).</w:t>
+            </w:r>
+            <w:r>
+              <w:rPr>
+                <w:rFonts w:ascii="Segoe UI" w:eastAsia="Times New Roman" w:hAnsi="Segoe UI" w:cs="Segoe UI"/>
+                <w:kern w:val="0"/>
+                <w:sz w:val="23"/>
+                <w:szCs w:val="23"/>
+                <w:lang w:val="es-US" w:eastAsia="es-US"/>
+                <w14:ligatures w14:val="none"/>
+              </w:rPr>
+              <w:br/>
+              <w:t>- Elaboración de matriz de riesgos cuantificada y mapa de calor.</w:t>
+            </w:r>
+            <w:r>
+              <w:rPr>
+                <w:rFonts w:ascii="Segoe UI" w:eastAsia="Times New Roman" w:hAnsi="Segoe UI" w:cs="Segoe UI"/>
+                <w:kern w:val="0"/>
+                <w:sz w:val="23"/>
+                <w:szCs w:val="23"/>
+                <w:lang w:val="es-US" w:eastAsia="es-US"/>
+                <w14:ligatures w14:val="none"/>
+              </w:rPr>
+              <w:br/>
+              <w:t xml:space="preserve">- Desarrollo de recomendaciones priorizadas (inmediatas, corto plazo, mediano </w:t>
+            </w:r>
+            <w:r>
+              <w:rPr>
+                <w:rFonts w:ascii="Segoe UI" w:eastAsia="Times New Roman" w:hAnsi="Segoe UI" w:cs="Segoe UI"/>
+                <w:kern w:val="0"/>
+                <w:sz w:val="23"/>
+                <w:szCs w:val="23"/>
+                <w:lang w:val="es-US" w:eastAsia="es-US"/>
+                <w14:ligatures w14:val="none"/>
+              </w:rPr>
+              <w:lastRenderedPageBreak/>
+              <w:t>plazo).</w:t>
+            </w:r>
+            <w:r>
+              <w:rPr>
+                <w:rFonts w:ascii="Segoe UI" w:eastAsia="Times New Roman" w:hAnsi="Segoe UI" w:cs="Segoe UI"/>
+                <w:kern w:val="0"/>
+                <w:sz w:val="23"/>
+                <w:szCs w:val="23"/>
+                <w:lang w:val="es-US" w:eastAsia="es-US"/>
+                <w14:ligatures w14:val="none"/>
+              </w:rPr>
+              <w:br/>
+              <w:t>- Elaboración del Plan de Mejora como documento independiente.</w:t>
+            </w:r>
+            <w:r>
+              <w:rPr>
+                <w:rFonts w:ascii="Segoe UI" w:eastAsia="Times New Roman" w:hAnsi="Segoe UI" w:cs="Segoe UI"/>
+                <w:kern w:val="0"/>
+                <w:sz w:val="23"/>
+                <w:szCs w:val="23"/>
+                <w:lang w:val="es-US" w:eastAsia="es-US"/>
+                <w14:ligatures w14:val="none"/>
+              </w:rPr>
+              <w:br/>
+              <w:t>- Revisión y validación interna del informe por todo el equipo auditor.</w:t>
+            </w:r>
+          </w:p>
+        </w:tc>
+        <w:tc>
+          <w:tcPr>
+            <w:tcW w:w="2261" w:type="dxa"/>
+            <w:tcMar>
+              <w:top w:w="150" w:type="dxa"/>
+              <w:left w:w="240" w:type="dxa"/>
+              <w:bottom w:w="150" w:type="dxa"/>
+              <w:right w:w="240" w:type="dxa"/>
+            </w:tcMar>
+            <w:vAlign w:val="center"/>
+            <w:hideMark/>
+          </w:tcPr>
+          <w:p>
+            <w:pPr>
+              <w:spacing w:after="0" w:line="375" w:lineRule="atLeast"/>
+              <w:rPr>
+                <w:rFonts w:ascii="Segoe UI" w:eastAsia="Times New Roman" w:hAnsi="Segoe UI" w:cs="Segoe UI"/>
+                <w:kern w:val="0"/>
+                <w:sz w:val="23"/>
+                <w:szCs w:val="23"/>
+                <w:lang w:val="es-US" w:eastAsia="es-US"/>
+                <w14:ligatures w14:val="none"/>
+              </w:rPr>
+            </w:pPr>
+            <w:r>
+              <w:rPr>
+                <w:rFonts w:ascii="Segoe UI" w:eastAsia="Times New Roman" w:hAnsi="Segoe UI" w:cs="Segoe UI"/>
+                <w:b/>
+                <w:bCs/>
+                <w:kern w:val="0"/>
+                <w:sz w:val="23"/>
+                <w:szCs w:val="23"/>
+                <w:lang w:val="es-US" w:eastAsia="es-US"/>
+                <w14:ligatures w14:val="none"/>
+              </w:rPr>
+              <w:lastRenderedPageBreak/>
+              <w:t>Auditor Líder:</w:t>
+            </w:r>
+            <w:r>
+              <w:rPr>
+                <w:rFonts w:ascii="Segoe UI" w:eastAsia="Times New Roman" w:hAnsi="Segoe UI" w:cs="Segoe UI"/>
+                <w:kern w:val="0"/>
+                <w:sz w:val="23"/>
+                <w:szCs w:val="23"/>
+                <w:lang w:val="es-US" w:eastAsia="es-US"/>
+                <w14:ligatures w14:val="none"/>
+              </w:rPr>
+              <w:t> Br. Gerson Antonio Valdivia</w:t>
+            </w:r>
+            <w:r>
+              <w:rPr>
+                <w:rFonts w:ascii="Segoe UI" w:eastAsia="Times New Roman" w:hAnsi="Segoe UI" w:cs="Segoe UI"/>
+                <w:kern w:val="0"/>
+                <w:sz w:val="23"/>
+                <w:szCs w:val="23"/>
+                <w:lang w:val="es-US" w:eastAsia="es-US"/>
+                <w14:ligatures w14:val="none"/>
+              </w:rPr>
+              <w:br/>
+            </w:r>
+            <w:r>
+              <w:rPr>
+                <w:rFonts w:ascii="Segoe UI" w:eastAsia="Times New Roman" w:hAnsi="Segoe UI" w:cs="Segoe UI"/>
+                <w:b/>
+                <w:bCs/>
+                <w:kern w:val="0"/>
+                <w:sz w:val="23"/>
+                <w:szCs w:val="23"/>
+                <w:lang w:val="es-US" w:eastAsia="es-US"/>
+                <w14:ligatures w14:val="none"/>
+              </w:rPr>
+              <w:t>Auditor Lógico:</w:t>
+            </w:r>
+            <w:r>
+              <w:rPr>
+                <w:rFonts w:ascii="Segoe UI" w:eastAsia="Times New Roman" w:hAnsi="Segoe UI" w:cs="Segoe UI"/>
+                <w:kern w:val="0"/>
+                <w:sz w:val="23"/>
+                <w:szCs w:val="23"/>
+                <w:lang w:val="es-US" w:eastAsia="es-US"/>
+                <w14:ligatures w14:val="none"/>
+              </w:rPr>
+              <w:t> Br. Stephanie Lucía Mora Chávez</w:t>
+            </w:r>
+            <w:r>
+              <w:rPr>
+                <w:rFonts w:ascii="Segoe UI" w:eastAsia="Times New Roman" w:hAnsi="Segoe UI" w:cs="Segoe UI"/>
+                <w:kern w:val="0"/>
+                <w:sz w:val="23"/>
+                <w:szCs w:val="23"/>
+                <w:lang w:val="es-US" w:eastAsia="es-US"/>
+                <w14:ligatures w14:val="none"/>
+              </w:rPr>
+              <w:br/>
+            </w:r>
+            <w:r>
+              <w:rPr>
+                <w:rFonts w:ascii="Segoe UI" w:eastAsia="Times New Roman" w:hAnsi="Segoe UI" w:cs="Segoe UI"/>
+                <w:b/>
+                <w:bCs/>
+                <w:kern w:val="0"/>
+                <w:sz w:val="23"/>
+                <w:szCs w:val="23"/>
+                <w:lang w:val="es-US" w:eastAsia="es-US"/>
+                <w14:ligatures w14:val="none"/>
+              </w:rPr>
+              <w:t>Auditor Físico:</w:t>
+            </w:r>
+            <w:r>
+              <w:rPr>
+                <w:rFonts w:ascii="Segoe UI" w:eastAsia="Times New Roman" w:hAnsi="Segoe UI" w:cs="Segoe UI"/>
+                <w:kern w:val="0"/>
+                <w:sz w:val="23"/>
+                <w:szCs w:val="23"/>
+                <w:lang w:val="es-US" w:eastAsia="es-US"/>
+                <w14:ligatures w14:val="none"/>
+              </w:rPr>
+              <w:t xml:space="preserve"> Br. </w:t>
+            </w:r>
+            <w:proofErr w:type="spellStart"/>
+            <w:r>
+              <w:rPr>
+                <w:rFonts w:ascii="Segoe UI" w:eastAsia="Times New Roman" w:hAnsi="Segoe UI" w:cs="Segoe UI"/>
+                <w:kern w:val="0"/>
+                <w:sz w:val="23"/>
+                <w:szCs w:val="23"/>
+                <w:lang w:val="es-US" w:eastAsia="es-US"/>
+                <w14:ligatures w14:val="none"/>
+              </w:rPr>
+              <w:t>Haxell</w:t>
+            </w:r>
+            <w:proofErr w:type="spellEnd"/>
+            <w:r>
+              <w:rPr>
+                <w:rFonts w:ascii="Segoe UI" w:eastAsia="Times New Roman" w:hAnsi="Segoe UI" w:cs="Segoe UI"/>
+                <w:kern w:val="0"/>
+                <w:sz w:val="23"/>
+                <w:szCs w:val="23"/>
+                <w:lang w:val="es-US" w:eastAsia="es-US"/>
+                <w14:ligatures w14:val="none"/>
+              </w:rPr>
+              <w:t xml:space="preserve"> Antonio Trejos </w:t>
+            </w:r>
+            <w:proofErr w:type="spellStart"/>
+            <w:r>
+              <w:rPr>
+                <w:rFonts w:ascii="Segoe UI" w:eastAsia="Times New Roman" w:hAnsi="Segoe UI" w:cs="Segoe UI"/>
+                <w:kern w:val="0"/>
+                <w:sz w:val="23"/>
+                <w:szCs w:val="23"/>
+                <w:lang w:val="es-US" w:eastAsia="es-US"/>
+                <w14:ligatures w14:val="none"/>
+              </w:rPr>
+              <w:t>Rodriguez</w:t>
+            </w:r>
+            <w:proofErr w:type="spellEnd"/>
+            <w:r>
+              <w:rPr>
+                <w:rFonts w:ascii="Segoe UI" w:eastAsia="Times New Roman" w:hAnsi="Segoe UI" w:cs="Segoe UI"/>
+                <w:kern w:val="0"/>
+                <w:sz w:val="23"/>
+                <w:szCs w:val="23"/>
+                <w:lang w:val="es-US" w:eastAsia="es-US"/>
+                <w14:ligatures w14:val="none"/>
+              </w:rPr>
+              <w:br/>
+            </w:r>
+            <w:r>
+              <w:rPr>
+                <w:rFonts w:ascii="Segoe UI" w:eastAsia="Times New Roman" w:hAnsi="Segoe UI" w:cs="Segoe UI"/>
+                <w:b/>
+                <w:bCs/>
+                <w:kern w:val="0"/>
+                <w:sz w:val="23"/>
+                <w:szCs w:val="23"/>
+                <w:lang w:val="es-US" w:eastAsia="es-US"/>
+                <w14:ligatures w14:val="none"/>
+              </w:rPr>
+              <w:t>Auditor Administrativo:</w:t>
+            </w:r>
+            <w:r>
+              <w:rPr>
+                <w:rFonts w:ascii="Segoe UI" w:eastAsia="Times New Roman" w:hAnsi="Segoe UI" w:cs="Segoe UI"/>
+                <w:kern w:val="0"/>
+                <w:sz w:val="23"/>
+                <w:szCs w:val="23"/>
+                <w:lang w:val="es-US" w:eastAsia="es-US"/>
+                <w14:ligatures w14:val="none"/>
+              </w:rPr>
+              <w:t xml:space="preserve"> Br. Alison Michelle Navarro </w:t>
+            </w:r>
+            <w:proofErr w:type="spellStart"/>
+            <w:r>
+              <w:rPr>
+                <w:rFonts w:ascii="Segoe UI" w:eastAsia="Times New Roman" w:hAnsi="Segoe UI" w:cs="Segoe UI"/>
+                <w:kern w:val="0"/>
+                <w:sz w:val="23"/>
+                <w:szCs w:val="23"/>
+                <w:lang w:val="es-US" w:eastAsia="es-US"/>
+                <w14:ligatures w14:val="none"/>
+              </w:rPr>
+              <w:t>Goussen</w:t>
+            </w:r>
+            <w:proofErr w:type="spellEnd"/>
+            <w:r>
+              <w:rPr>
+                <w:rFonts w:ascii="Segoe UI" w:eastAsia="Times New Roman" w:hAnsi="Segoe UI" w:cs="Segoe UI"/>
+                <w:kern w:val="0"/>
+                <w:sz w:val="23"/>
+                <w:szCs w:val="23"/>
+                <w:lang w:val="es-US" w:eastAsia="es-US"/>
+                <w14:ligatures w14:val="none"/>
+              </w:rPr>
+              <w:br/>
+            </w:r>
+            <w:r>
+              <w:rPr>
+                <w:rFonts w:ascii="Segoe UI" w:eastAsia="Times New Roman" w:hAnsi="Segoe UI" w:cs="Segoe UI"/>
+                <w:b/>
+                <w:bCs/>
+                <w:kern w:val="0"/>
+                <w:sz w:val="23"/>
+                <w:szCs w:val="23"/>
+                <w:lang w:val="es-US" w:eastAsia="es-US"/>
+                <w14:ligatures w14:val="none"/>
+              </w:rPr>
+              <w:t>Documentalista:</w:t>
+            </w:r>
+            <w:r>
+              <w:rPr>
+                <w:rFonts w:ascii="Segoe UI" w:eastAsia="Times New Roman" w:hAnsi="Segoe UI" w:cs="Segoe UI"/>
+                <w:kern w:val="0"/>
+                <w:sz w:val="23"/>
+                <w:szCs w:val="23"/>
+                <w:lang w:val="es-US" w:eastAsia="es-US"/>
+                <w14:ligatures w14:val="none"/>
+              </w:rPr>
+              <w:t> Br. Arleth del Rosario Velásquez Gómez</w:t>
+            </w:r>
+          </w:p>
+        </w:tc>
+        <w:tc>
+          <w:tcPr>
+            <w:tcW w:w="2329" w:type="dxa"/>
+            <w:tcMar>
+              <w:top w:w="150" w:type="dxa"/>
+              <w:left w:w="240" w:type="dxa"/>
+              <w:bottom w:w="150" w:type="dxa"/>
+              <w:right w:w="0" w:type="dxa"/>
+            </w:tcMar>
+            <w:vAlign w:val="center"/>
+            <w:hideMark/>
+          </w:tcPr>
+          <w:p>
+            <w:pPr>
+              <w:spacing w:after="0" w:line="375" w:lineRule="atLeast"/>
+              <w:rPr>
+                <w:rFonts w:ascii="Segoe UI" w:eastAsia="Times New Roman" w:hAnsi="Segoe UI" w:cs="Segoe UI"/>
+                <w:kern w:val="0"/>
+                <w:sz w:val="23"/>
+                <w:szCs w:val="23"/>
+                <w:lang w:val="es-US" w:eastAsia="es-US"/>
+                <w14:ligatures w14:val="none"/>
+              </w:rPr>
+            </w:pPr>
+            <w:r>
+              <w:rPr>
+                <w:rFonts w:ascii="Segoe UI" w:eastAsia="Times New Roman" w:hAnsi="Segoe UI" w:cs="Segoe UI"/>
+                <w:kern w:val="0"/>
+                <w:sz w:val="23"/>
+                <w:szCs w:val="23"/>
+                <w:lang w:val="es-US" w:eastAsia="es-US"/>
+                <w14:ligatures w14:val="none"/>
+              </w:rPr>
+              <w:t>Profesionales con habilidades de redacción técnica especializada en auditoría de redes y hardware, estructuración de informes conforme a estándares internacionales, síntesis de hallazgos técnicos, capacidad de generar recomendaciones accionables y orientación a la mejora continua de la infraestructura tecnológica.</w:t>
+            </w:r>
+          </w:p>
+        </w:tc>
+      </w:tr>
+      <w:tr>
+        <w:tc>
+          <w:tcPr>
+            <w:tcW w:w="1618" w:type="dxa"/>
+            <w:tcMar>
+              <w:top w:w="150" w:type="dxa"/>
+              <w:left w:w="0" w:type="dxa"/>
+              <w:bottom w:w="150" w:type="dxa"/>
+              <w:right w:w="240" w:type="dxa"/>
+            </w:tcMar>
+            <w:vAlign w:val="center"/>
+            <w:hideMark/>
+          </w:tcPr>
+          <w:p>
+            <w:pPr>
+              <w:spacing w:after="0" w:line="375" w:lineRule="atLeast"/>
+              <w:rPr>
+                <w:rFonts w:ascii="Segoe UI" w:eastAsia="Times New Roman" w:hAnsi="Segoe UI" w:cs="Segoe UI"/>
+                <w:kern w:val="0"/>
+                <w:sz w:val="23"/>
+                <w:szCs w:val="23"/>
+                <w:lang w:val="es-US" w:eastAsia="es-US"/>
+                <w14:ligatures w14:val="none"/>
+              </w:rPr>
+            </w:pPr>
+            <w:r>
+              <w:rPr>
+                <w:rFonts w:ascii="Segoe UI" w:eastAsia="Times New Roman" w:hAnsi="Segoe UI" w:cs="Segoe UI"/>
+                <w:b/>
+                <w:bCs/>
+                <w:kern w:val="0"/>
+                <w:sz w:val="23"/>
+                <w:szCs w:val="23"/>
+                <w:lang w:val="es-US" w:eastAsia="es-US"/>
+                <w14:ligatures w14:val="none"/>
+              </w:rPr>
+              <w:t>V. Reunión de Cierre y Seguimiento</w:t>
+            </w:r>
+          </w:p>
+        </w:tc>
+        <w:tc>
+          <w:tcPr>
+            <w:tcW w:w="2267" w:type="dxa"/>
+            <w:tcMar>
+              <w:top w:w="150" w:type="dxa"/>
+              <w:left w:w="240" w:type="dxa"/>
+              <w:bottom w:w="150" w:type="dxa"/>
+              <w:right w:w="240" w:type="dxa"/>
+            </w:tcMar>
+            <w:vAlign w:val="center"/>
+            <w:hideMark/>
+          </w:tcPr>
+          <w:p>
+            <w:pPr>
+              <w:spacing w:after="0" w:line="375" w:lineRule="atLeast"/>
+              <w:rPr>
+                <w:rFonts w:ascii="Segoe UI" w:eastAsia="Times New Roman" w:hAnsi="Segoe UI" w:cs="Segoe UI"/>
+                <w:kern w:val="0"/>
+                <w:sz w:val="23"/>
+                <w:szCs w:val="23"/>
+                <w:lang w:val="es-US" w:eastAsia="es-US"/>
+                <w14:ligatures w14:val="none"/>
+              </w:rPr>
+            </w:pPr>
+            <w:r>
+              <w:rPr>
+                <w:rFonts w:ascii="Segoe UI" w:eastAsia="Times New Roman" w:hAnsi="Segoe UI" w:cs="Segoe UI"/>
+                <w:kern w:val="0"/>
+                <w:sz w:val="23"/>
+                <w:szCs w:val="23"/>
+                <w:lang w:val="es-US" w:eastAsia="es-US"/>
+                <w14:ligatures w14:val="none"/>
+              </w:rPr>
+              <w:t>Presentar los resultados de la auditoría a la Dirección del Instituto Ulises Tapia Roa y establecer acuerdos para implementar las mejoras en la red y el hardware.</w:t>
+            </w:r>
+          </w:p>
+        </w:tc>
+        <w:tc>
+          <w:tcPr>
+            <w:tcW w:w="3135" w:type="dxa"/>
+            <w:tcMar>
+              <w:top w:w="150" w:type="dxa"/>
+              <w:left w:w="240" w:type="dxa"/>
+              <w:bottom w:w="150" w:type="dxa"/>
+              <w:right w:w="240" w:type="dxa"/>
+            </w:tcMar>
+            <w:vAlign w:val="center"/>
+            <w:hideMark/>
+          </w:tcPr>
+          <w:p>
+            <w:pPr>
+              <w:spacing w:after="0" w:line="375" w:lineRule="atLeast"/>
+              <w:rPr>
+                <w:rFonts w:ascii="Segoe UI" w:eastAsia="Times New Roman" w:hAnsi="Segoe UI" w:cs="Segoe UI"/>
+                <w:kern w:val="0"/>
+                <w:sz w:val="23"/>
+                <w:szCs w:val="23"/>
+                <w:lang w:val="es-US" w:eastAsia="es-US"/>
+                <w14:ligatures w14:val="none"/>
+              </w:rPr>
+            </w:pPr>
+            <w:r>
+              <w:rPr>
+                <w:rFonts w:ascii="Segoe UI" w:eastAsia="Times New Roman" w:hAnsi="Segoe UI" w:cs="Segoe UI"/>
+                <w:kern w:val="0"/>
+                <w:sz w:val="23"/>
+                <w:szCs w:val="23"/>
+                <w:lang w:val="es-US" w:eastAsia="es-US"/>
+                <w14:ligatures w14:val="none"/>
+              </w:rPr>
+              <w:t>- Presentación del informe final a la Dirección del Instituto (hallazgos, riesgos, recomendaciones).</w:t>
+            </w:r>
+            <w:r>
+              <w:rPr>
+                <w:rFonts w:ascii="Segoe UI" w:eastAsia="Times New Roman" w:hAnsi="Segoe UI" w:cs="Segoe UI"/>
+                <w:kern w:val="0"/>
+                <w:sz w:val="23"/>
+                <w:szCs w:val="23"/>
+                <w:lang w:val="es-US" w:eastAsia="es-US"/>
+                <w14:ligatures w14:val="none"/>
+              </w:rPr>
+              <w:br/>
+              <w:t>- Explicación detallada de los hallazgos críticos (R-03: Acceso no autorizado a datos del Director; R-20: Pérdida de información por falta de respaldo) y altos.</w:t>
+            </w:r>
+            <w:r>
+              <w:rPr>
+                <w:rFonts w:ascii="Segoe UI" w:eastAsia="Times New Roman" w:hAnsi="Segoe UI" w:cs="Segoe UI"/>
+                <w:kern w:val="0"/>
+                <w:sz w:val="23"/>
+                <w:szCs w:val="23"/>
+                <w:lang w:val="es-US" w:eastAsia="es-US"/>
+                <w14:ligatures w14:val="none"/>
+              </w:rPr>
+              <w:br/>
+              <w:t>- Entrega formal del Informe Final de Auditoría (2 copias impresas + digital).</w:t>
+            </w:r>
+            <w:r>
+              <w:rPr>
+                <w:rFonts w:ascii="Segoe UI" w:eastAsia="Times New Roman" w:hAnsi="Segoe UI" w:cs="Segoe UI"/>
+                <w:kern w:val="0"/>
+                <w:sz w:val="23"/>
+                <w:szCs w:val="23"/>
+                <w:lang w:val="es-US" w:eastAsia="es-US"/>
+                <w14:ligatures w14:val="none"/>
+              </w:rPr>
+              <w:br/>
+              <w:t>- Entrega del Plan de Mejora y Kit de herramientas para mantenimiento de red y hardware.</w:t>
+            </w:r>
+            <w:r>
+              <w:rPr>
+                <w:rFonts w:ascii="Segoe UI" w:eastAsia="Times New Roman" w:hAnsi="Segoe UI" w:cs="Segoe UI"/>
+                <w:kern w:val="0"/>
+                <w:sz w:val="23"/>
+                <w:szCs w:val="23"/>
+                <w:lang w:val="es-US" w:eastAsia="es-US"/>
+                <w14:ligatures w14:val="none"/>
+              </w:rPr>
+              <w:br/>
+              <w:t xml:space="preserve">- Validación del plan de acción con la Dirección </w:t>
+            </w:r>
+            <w:r>
+              <w:rPr>
+                <w:rFonts w:ascii="Segoe UI" w:eastAsia="Times New Roman" w:hAnsi="Segoe UI" w:cs="Segoe UI"/>
+                <w:kern w:val="0"/>
+                <w:sz w:val="23"/>
+                <w:szCs w:val="23"/>
+                <w:lang w:val="es-US" w:eastAsia="es-US"/>
+                <w14:ligatures w14:val="none"/>
+              </w:rPr>
+              <w:lastRenderedPageBreak/>
+              <w:t>(responsables, plazos, recursos).</w:t>
+            </w:r>
+            <w:r>
+              <w:rPr>
+                <w:rFonts w:ascii="Segoe UI" w:eastAsia="Times New Roman" w:hAnsi="Segoe UI" w:cs="Segoe UI"/>
+                <w:kern w:val="0"/>
+                <w:sz w:val="23"/>
+                <w:szCs w:val="23"/>
+                <w:lang w:val="es-US" w:eastAsia="es-US"/>
+                <w14:ligatures w14:val="none"/>
+              </w:rPr>
+              <w:br/>
+              <w:t>- Propuesta de seguimiento (auditoría de seguimiento a 3 y 6 meses).</w:t>
+            </w:r>
+            <w:r>
+              <w:rPr>
+                <w:rFonts w:ascii="Segoe UI" w:eastAsia="Times New Roman" w:hAnsi="Segoe UI" w:cs="Segoe UI"/>
+                <w:kern w:val="0"/>
+                <w:sz w:val="23"/>
+                <w:szCs w:val="23"/>
+                <w:lang w:val="es-US" w:eastAsia="es-US"/>
+                <w14:ligatures w14:val="none"/>
+              </w:rPr>
+              <w:br/>
+              <w:t>- Firma de Acta de Cierre de Proyecto y Acuse de Recibo del Informe.</w:t>
+            </w:r>
+            <w:r>
+              <w:rPr>
+                <w:rFonts w:ascii="Segoe UI" w:eastAsia="Times New Roman" w:hAnsi="Segoe UI" w:cs="Segoe UI"/>
+                <w:kern w:val="0"/>
+                <w:sz w:val="23"/>
+                <w:szCs w:val="23"/>
+                <w:lang w:val="es-US" w:eastAsia="es-US"/>
+                <w14:ligatures w14:val="none"/>
+              </w:rPr>
+              <w:br/>
+              <w:t>- Entrega de Certificado de Auditoría (constancia de realización).</w:t>
+            </w:r>
+          </w:p>
+        </w:tc>
+        <w:tc>
+          <w:tcPr>
+            <w:tcW w:w="2261" w:type="dxa"/>
+            <w:tcMar>
+              <w:top w:w="150" w:type="dxa"/>
+              <w:left w:w="240" w:type="dxa"/>
+              <w:bottom w:w="150" w:type="dxa"/>
+              <w:right w:w="240" w:type="dxa"/>
+            </w:tcMar>
+            <w:vAlign w:val="center"/>
+            <w:hideMark/>
+          </w:tcPr>
+          <w:p>
+            <w:pPr>
+              <w:spacing w:after="0" w:line="375" w:lineRule="atLeast"/>
+              <w:rPr>
+                <w:rFonts w:ascii="Segoe UI" w:eastAsia="Times New Roman" w:hAnsi="Segoe UI" w:cs="Segoe UI"/>
+                <w:kern w:val="0"/>
+                <w:sz w:val="23"/>
+                <w:szCs w:val="23"/>
+                <w:lang w:val="es-US" w:eastAsia="es-US"/>
+                <w14:ligatures w14:val="none"/>
+              </w:rPr>
+            </w:pPr>
+            <w:r>
+              <w:rPr>
+                <w:rFonts w:ascii="Segoe UI" w:eastAsia="Times New Roman" w:hAnsi="Segoe UI" w:cs="Segoe UI"/>
+                <w:b/>
+                <w:bCs/>
+                <w:kern w:val="0"/>
+                <w:sz w:val="23"/>
+                <w:szCs w:val="23"/>
+                <w:lang w:val="es-US" w:eastAsia="es-US"/>
+                <w14:ligatures w14:val="none"/>
+              </w:rPr>
+              <w:lastRenderedPageBreak/>
+              <w:t>Auditor Líder:</w:t>
+            </w:r>
+            <w:r>
+              <w:rPr>
+                <w:rFonts w:ascii="Segoe UI" w:eastAsia="Times New Roman" w:hAnsi="Segoe UI" w:cs="Segoe UI"/>
+                <w:kern w:val="0"/>
+                <w:sz w:val="23"/>
+                <w:szCs w:val="23"/>
+                <w:lang w:val="es-US" w:eastAsia="es-US"/>
+                <w14:ligatures w14:val="none"/>
+              </w:rPr>
+              <w:t> Br. Gerson Antonio Valdivia</w:t>
+            </w:r>
+            <w:r>
+              <w:rPr>
+                <w:rFonts w:ascii="Segoe UI" w:eastAsia="Times New Roman" w:hAnsi="Segoe UI" w:cs="Segoe UI"/>
+                <w:kern w:val="0"/>
+                <w:sz w:val="23"/>
+                <w:szCs w:val="23"/>
+                <w:lang w:val="es-US" w:eastAsia="es-US"/>
+                <w14:ligatures w14:val="none"/>
+              </w:rPr>
+              <w:br/>
+            </w:r>
+            <w:r>
+              <w:rPr>
+                <w:rFonts w:ascii="Segoe UI" w:eastAsia="Times New Roman" w:hAnsi="Segoe UI" w:cs="Segoe UI"/>
+                <w:b/>
+                <w:bCs/>
+                <w:kern w:val="0"/>
+                <w:sz w:val="23"/>
+                <w:szCs w:val="23"/>
+                <w:lang w:val="es-US" w:eastAsia="es-US"/>
+                <w14:ligatures w14:val="none"/>
+              </w:rPr>
+              <w:t>Auditor Físico:</w:t>
+            </w:r>
+            <w:r>
+              <w:rPr>
+                <w:rFonts w:ascii="Segoe UI" w:eastAsia="Times New Roman" w:hAnsi="Segoe UI" w:cs="Segoe UI"/>
+                <w:kern w:val="0"/>
+                <w:sz w:val="23"/>
+                <w:szCs w:val="23"/>
+                <w:lang w:val="es-US" w:eastAsia="es-US"/>
+                <w14:ligatures w14:val="none"/>
+              </w:rPr>
+              <w:t xml:space="preserve"> Br. </w:t>
+            </w:r>
+            <w:proofErr w:type="spellStart"/>
+            <w:r>
+              <w:rPr>
+                <w:rFonts w:ascii="Segoe UI" w:eastAsia="Times New Roman" w:hAnsi="Segoe UI" w:cs="Segoe UI"/>
+                <w:kern w:val="0"/>
+                <w:sz w:val="23"/>
+                <w:szCs w:val="23"/>
+                <w:lang w:val="es-US" w:eastAsia="es-US"/>
+                <w14:ligatures w14:val="none"/>
+              </w:rPr>
+              <w:t>Haxell</w:t>
+            </w:r>
+            <w:proofErr w:type="spellEnd"/>
+            <w:r>
+              <w:rPr>
+                <w:rFonts w:ascii="Segoe UI" w:eastAsia="Times New Roman" w:hAnsi="Segoe UI" w:cs="Segoe UI"/>
+                <w:kern w:val="0"/>
+                <w:sz w:val="23"/>
+                <w:szCs w:val="23"/>
+                <w:lang w:val="es-US" w:eastAsia="es-US"/>
+                <w14:ligatures w14:val="none"/>
+              </w:rPr>
+              <w:t xml:space="preserve"> Antonio Trejos </w:t>
+            </w:r>
+            <w:proofErr w:type="spellStart"/>
+            <w:r>
+              <w:rPr>
+                <w:rFonts w:ascii="Segoe UI" w:eastAsia="Times New Roman" w:hAnsi="Segoe UI" w:cs="Segoe UI"/>
+                <w:kern w:val="0"/>
+                <w:sz w:val="23"/>
+                <w:szCs w:val="23"/>
+                <w:lang w:val="es-US" w:eastAsia="es-US"/>
+                <w14:ligatures w14:val="none"/>
+              </w:rPr>
+              <w:t>Rodriguez</w:t>
+            </w:r>
+            <w:proofErr w:type="spellEnd"/>
+            <w:r>
+              <w:rPr>
+                <w:rFonts w:ascii="Segoe UI" w:eastAsia="Times New Roman" w:hAnsi="Segoe UI" w:cs="Segoe UI"/>
+                <w:kern w:val="0"/>
+                <w:sz w:val="23"/>
+                <w:szCs w:val="23"/>
+                <w:lang w:val="es-US" w:eastAsia="es-US"/>
+                <w14:ligatures w14:val="none"/>
+              </w:rPr>
+              <w:br/>
+            </w:r>
+            <w:r>
+              <w:rPr>
+                <w:rFonts w:ascii="Segoe UI" w:eastAsia="Times New Roman" w:hAnsi="Segoe UI" w:cs="Segoe UI"/>
+                <w:b/>
+                <w:bCs/>
+                <w:kern w:val="0"/>
+                <w:sz w:val="23"/>
+                <w:szCs w:val="23"/>
+                <w:lang w:val="es-US" w:eastAsia="es-US"/>
+                <w14:ligatures w14:val="none"/>
+              </w:rPr>
+              <w:t>Auditor Lógico:</w:t>
+            </w:r>
+            <w:r>
+              <w:rPr>
+                <w:rFonts w:ascii="Segoe UI" w:eastAsia="Times New Roman" w:hAnsi="Segoe UI" w:cs="Segoe UI"/>
+                <w:kern w:val="0"/>
+                <w:sz w:val="23"/>
+                <w:szCs w:val="23"/>
+                <w:lang w:val="es-US" w:eastAsia="es-US"/>
+                <w14:ligatures w14:val="none"/>
+              </w:rPr>
+              <w:t> Br. Stephanie Lucía Mora Chávez</w:t>
+            </w:r>
+            <w:r>
+              <w:rPr>
+                <w:rFonts w:ascii="Segoe UI" w:eastAsia="Times New Roman" w:hAnsi="Segoe UI" w:cs="Segoe UI"/>
+                <w:kern w:val="0"/>
+                <w:sz w:val="23"/>
+                <w:szCs w:val="23"/>
+                <w:lang w:val="es-US" w:eastAsia="es-US"/>
+                <w14:ligatures w14:val="none"/>
+              </w:rPr>
+              <w:br/>
+            </w:r>
+            <w:r>
+              <w:rPr>
+                <w:rFonts w:ascii="Segoe UI" w:eastAsia="Times New Roman" w:hAnsi="Segoe UI" w:cs="Segoe UI"/>
+                <w:b/>
+                <w:bCs/>
+                <w:kern w:val="0"/>
+                <w:sz w:val="23"/>
+                <w:szCs w:val="23"/>
+                <w:lang w:val="es-US" w:eastAsia="es-US"/>
+                <w14:ligatures w14:val="none"/>
+              </w:rPr>
+              <w:t>Auditor Administrativo:</w:t>
+            </w:r>
+            <w:r>
+              <w:rPr>
+                <w:rFonts w:ascii="Segoe UI" w:eastAsia="Times New Roman" w:hAnsi="Segoe UI" w:cs="Segoe UI"/>
+                <w:kern w:val="0"/>
+                <w:sz w:val="23"/>
+                <w:szCs w:val="23"/>
+                <w:lang w:val="es-US" w:eastAsia="es-US"/>
+                <w14:ligatures w14:val="none"/>
+              </w:rPr>
+              <w:t xml:space="preserve"> Br. Alison Michelle Navarro </w:t>
+            </w:r>
+            <w:proofErr w:type="spellStart"/>
+            <w:r>
+              <w:rPr>
+                <w:rFonts w:ascii="Segoe UI" w:eastAsia="Times New Roman" w:hAnsi="Segoe UI" w:cs="Segoe UI"/>
+                <w:kern w:val="0"/>
+                <w:sz w:val="23"/>
+                <w:szCs w:val="23"/>
+                <w:lang w:val="es-US" w:eastAsia="es-US"/>
+                <w14:ligatures w14:val="none"/>
+              </w:rPr>
+              <w:t>Goussen</w:t>
+            </w:r>
+            <w:proofErr w:type="spellEnd"/>
+            <w:r>
+              <w:rPr>
+                <w:rFonts w:ascii="Segoe UI" w:eastAsia="Times New Roman" w:hAnsi="Segoe UI" w:cs="Segoe UI"/>
+                <w:kern w:val="0"/>
+                <w:sz w:val="23"/>
+                <w:szCs w:val="23"/>
+                <w:lang w:val="es-US" w:eastAsia="es-US"/>
+                <w14:ligatures w14:val="none"/>
+              </w:rPr>
+              <w:br/>
+            </w:r>
+            <w:r>
+              <w:rPr>
+                <w:rFonts w:ascii="Segoe UI" w:eastAsia="Times New Roman" w:hAnsi="Segoe UI" w:cs="Segoe UI"/>
+                <w:b/>
+                <w:bCs/>
+                <w:kern w:val="0"/>
+                <w:sz w:val="23"/>
+                <w:szCs w:val="23"/>
+                <w:lang w:val="es-US" w:eastAsia="es-US"/>
+                <w14:ligatures w14:val="none"/>
+              </w:rPr>
+              <w:t>Documentalista:</w:t>
+            </w:r>
+            <w:r>
+              <w:rPr>
+                <w:rFonts w:ascii="Segoe UI" w:eastAsia="Times New Roman" w:hAnsi="Segoe UI" w:cs="Segoe UI"/>
+                <w:kern w:val="0"/>
+                <w:sz w:val="23"/>
+                <w:szCs w:val="23"/>
+                <w:lang w:val="es-US" w:eastAsia="es-US"/>
+                <w14:ligatures w14:val="none"/>
+              </w:rPr>
+              <w:t> Br. Arleth del Rosario Velásquez Gómez</w:t>
+            </w:r>
+            <w:r>
+              <w:rPr>
+                <w:rFonts w:ascii="Segoe UI" w:eastAsia="Times New Roman" w:hAnsi="Segoe UI" w:cs="Segoe UI"/>
+                <w:kern w:val="0"/>
+                <w:sz w:val="23"/>
+                <w:szCs w:val="23"/>
+                <w:lang w:val="es-US" w:eastAsia="es-US"/>
+                <w14:ligatures w14:val="none"/>
+              </w:rPr>
+              <w:br/>
+            </w:r>
+            <w:proofErr w:type="gramStart"/>
+            <w:r>
+              <w:rPr>
+                <w:rFonts w:ascii="Segoe UI" w:eastAsia="Times New Roman" w:hAnsi="Segoe UI" w:cs="Segoe UI"/>
+                <w:b/>
+                <w:bCs/>
+                <w:kern w:val="0"/>
+                <w:sz w:val="23"/>
+                <w:szCs w:val="23"/>
+                <w:lang w:val="es-US" w:eastAsia="es-US"/>
+                <w14:ligatures w14:val="none"/>
+              </w:rPr>
+              <w:t>Director</w:t>
+            </w:r>
+            <w:proofErr w:type="gramEnd"/>
+            <w:r>
+              <w:rPr>
+                <w:rFonts w:ascii="Segoe UI" w:eastAsia="Times New Roman" w:hAnsi="Segoe UI" w:cs="Segoe UI"/>
+                <w:b/>
+                <w:bCs/>
+                <w:kern w:val="0"/>
+                <w:sz w:val="23"/>
+                <w:szCs w:val="23"/>
+                <w:lang w:val="es-US" w:eastAsia="es-US"/>
+                <w14:ligatures w14:val="none"/>
+              </w:rPr>
+              <w:t xml:space="preserve"> del Instituto:</w:t>
+            </w:r>
+            <w:r>
+              <w:rPr>
+                <w:rFonts w:ascii="Segoe UI" w:eastAsia="Times New Roman" w:hAnsi="Segoe UI" w:cs="Segoe UI"/>
+                <w:kern w:val="0"/>
+                <w:sz w:val="23"/>
+                <w:szCs w:val="23"/>
+                <w:lang w:val="es-US" w:eastAsia="es-US"/>
+                <w14:ligatures w14:val="none"/>
+              </w:rPr>
+              <w:t> (repres</w:t>
+            </w:r>
+            <w:r>
+              <w:rPr>
+                <w:rFonts w:ascii="Segoe UI" w:eastAsia="Times New Roman" w:hAnsi="Segoe UI" w:cs="Segoe UI"/>
+                <w:kern w:val="0"/>
+                <w:sz w:val="23"/>
+                <w:szCs w:val="23"/>
+                <w:lang w:val="es-US" w:eastAsia="es-US"/>
+                <w14:ligatures w14:val="none"/>
+              </w:rPr>
+              <w:lastRenderedPageBreak/>
+              <w:t>entante de la entidad auditada)</w:t>
+            </w:r>
+          </w:p>
+        </w:tc>
+        <w:tc>
+          <w:tcPr>
+            <w:tcW w:w="2329" w:type="dxa"/>
+            <w:tcMar>
+              <w:top w:w="150" w:type="dxa"/>
+              <w:left w:w="240" w:type="dxa"/>
+              <w:bottom w:w="150" w:type="dxa"/>
+              <w:right w:w="0" w:type="dxa"/>
+            </w:tcMar>
+            <w:vAlign w:val="center"/>
+            <w:hideMark/>
+          </w:tcPr>
+          <w:p>
+            <w:pPr>
+              <w:spacing w:after="0" w:line="375" w:lineRule="atLeast"/>
+              <w:rPr>
+                <w:rFonts w:ascii="Segoe UI" w:eastAsia="Times New Roman" w:hAnsi="Segoe UI" w:cs="Segoe UI"/>
+                <w:kern w:val="0"/>
+                <w:sz w:val="23"/>
+                <w:szCs w:val="23"/>
+                <w:lang w:val="es-US" w:eastAsia="es-US"/>
+                <w14:ligatures w14:val="none"/>
+              </w:rPr>
+            </w:pPr>
+            <w:r>
+              <w:rPr>
+                <w:rFonts w:ascii="Segoe UI" w:eastAsia="Times New Roman" w:hAnsi="Segoe UI" w:cs="Segoe UI"/>
+                <w:kern w:val="0"/>
+                <w:sz w:val="23"/>
+                <w:szCs w:val="23"/>
+                <w:lang w:val="es-US" w:eastAsia="es-US"/>
+                <w14:ligatures w14:val="none"/>
+              </w:rPr>
+              <w:lastRenderedPageBreak/>
+              <w:t>Perfil con liderazgo, capacidad de negociación y comunicación asertiva para presentar hallazgos técnicos a personal no especializado (</w:t>
+            </w:r>
+            <w:proofErr w:type="gramStart"/>
+            <w:r>
+              <w:rPr>
+                <w:rFonts w:ascii="Segoe UI" w:eastAsia="Times New Roman" w:hAnsi="Segoe UI" w:cs="Segoe UI"/>
+                <w:kern w:val="0"/>
+                <w:sz w:val="23"/>
+                <w:szCs w:val="23"/>
+                <w:lang w:val="es-US" w:eastAsia="es-US"/>
+                <w14:ligatures w14:val="none"/>
+              </w:rPr>
+              <w:t>Director</w:t>
+            </w:r>
+            <w:proofErr w:type="gramEnd"/>
+            <w:r>
+              <w:rPr>
+                <w:rFonts w:ascii="Segoe UI" w:eastAsia="Times New Roman" w:hAnsi="Segoe UI" w:cs="Segoe UI"/>
+                <w:kern w:val="0"/>
+                <w:sz w:val="23"/>
+                <w:szCs w:val="23"/>
+                <w:lang w:val="es-US" w:eastAsia="es-US"/>
+                <w14:ligatures w14:val="none"/>
+              </w:rPr>
+              <w:t xml:space="preserve"> del Instituto). Dominio técnico de redes y hardware para justificar recomendaciones y promover la mejora de la infraestructura tecnológica del centro educativo. Conocimiento del contexto educativo público nicaragüense y de las limitaciones </w:t>
+            </w:r>
+            <w:r>
+              <w:rPr>
+                <w:rFonts w:ascii="Segoe UI" w:eastAsia="Times New Roman" w:hAnsi="Segoe UI" w:cs="Segoe UI"/>
+                <w:kern w:val="0"/>
+                <w:sz w:val="23"/>
+                <w:szCs w:val="23"/>
+                <w:lang w:val="es-US" w:eastAsia="es-US"/>
+                <w14:ligatures w14:val="none"/>
+              </w:rPr>
+              <w:lastRenderedPageBreak/>
+              <w:t>presupuestarias para proponer soluciones viables y de bajo costo.</w:t>
+            </w:r>
+          </w:p>
+        </w:tc>
+      </w:tr>
+    </w:tbl>
     <w:p>
       <w:pPr>
         <w:rPr>

</xml_diff>